<commit_message>
docs(lab1): update report with live Android emulator screenshots and verification
</commit_message>
<xml_diff>
--- a/Lab_1/ПМД_КН-2327Б_Багрій-Белз_ЛР-1.docx
+++ b/Lab_1/ПМД_КН-2327Б_Багрій-Белз_ЛР-1.docx
@@ -383,7 +383,7 @@
           <w:b w:val="0"/>
           <w:sz w:val="28"/>
         </w:rPr>
-        <w:t>Налаштування емулятора Android Virtual Device (AVD) та запуск тестів.</w:t>
+        <w:t>Налаштування емулятора Android Virtual Device (AVD) та тестування оточення.</w:t>
       </w:r>
     </w:p>
     <w:p>
@@ -397,7 +397,7 @@
           <w:b w:val="0"/>
           <w:sz w:val="28"/>
         </w:rPr>
-        <w:t>У Device Manager середовища Android Studio налаштовано віртуальний емулятор пристрою Google Android (профіль lab20). Виконано команду опитування доступних емуляторів у Flutter та проведено автоматизоване тестування віджетів у середовищі flutter test.</w:t>
+        <w:t>У Device Manager середовища Android Studio налаштовано віртуальний емулятор пристрою Google Android (профіль lab20, sdk gphone64 x86_64, Android 16 / API 36). Виконано запуск емулятора, перевірку його готовності в списку підключених пристроїв та тестування віджетів.</w:t>
       </w:r>
     </w:p>
     <w:p>
@@ -473,7 +473,7 @@
           <w:b w:val="0"/>
           <w:sz w:val="28"/>
         </w:rPr>
-        <w:t>Розробка інтерфейсу застосунку «Менеджер завдань» (Варіант 1) та запуск програми.</w:t>
+        <w:t>Розробка інтерфейсу застосунку «Менеджер завдань» (Варіант 1) та запуск на Android-емуляторі.</w:t>
       </w:r>
     </w:p>
     <w:p>
@@ -487,7 +487,7 @@
           <w:b/>
           <w:sz w:val="28"/>
         </w:rPr>
-        <w:t>1. Написання коду-розв'язку завдання (lib/main.dart):</w:t>
+        <w:t>1. Написання вихідного коду головного файлу (lib/main.dart):</w:t>
       </w:r>
     </w:p>
     <w:p>
@@ -1119,7 +1119,21 @@
           <w:b w:val="0"/>
           <w:sz w:val="19"/>
         </w:rPr>
-        <w:t xml:space="preserve">    TaskItem(title: 'Оформити звіт з лабораторної роботи №1', category: 'ПМД Лаб 1', isCompleted: false),</w:t>
+        <w:t xml:space="preserve">    TaskItem(title: 'Оформити звіт з лабораторної роботи №1', category: 'ПМД Лаб 1', isCompleted: true),</w:t>
+      </w:r>
+    </w:p>
+    <w:p>
+      <w:pPr>
+        <w:spacing w:line="190" w:lineRule="exact" w:after="0"/>
+        <w:jc w:val="left"/>
+      </w:pPr>
+      <w:r>
+        <w:rPr>
+          <w:rFonts w:ascii="Cascadia Mono" w:hAnsi="Cascadia Mono" w:cs="Cascadia Mono"/>
+          <w:b w:val="0"/>
+          <w:sz w:val="19"/>
+        </w:rPr>
+        <w:t xml:space="preserve">    TaskItem(title: 'Підготувати відповіді на контрольні запитання', category: 'ПМД Лаб 1', isCompleted: false),</w:t>
       </w:r>
     </w:p>
     <w:p>
@@ -1607,7 +1621,7 @@
           <w:b/>
           <w:sz w:val="28"/>
         </w:rPr>
-        <w:t>2. Результат виконання коду та функціонування застосунку:</w:t>
+        <w:t>2. Результат тестування та запуску застосунку на Android-емуляторі (Android 16 / API 36):</w:t>
       </w:r>
     </w:p>
     <w:p>
@@ -1618,7 +1632,7 @@
       <w:r>
         <w:drawing>
           <wp:inline xmlns:a="http://schemas.openxmlformats.org/drawingml/2006/main" xmlns:pic="http://schemas.openxmlformats.org/drawingml/2006/picture">
-            <wp:extent cx="6480000" cy="3645000"/>
+            <wp:extent cx="6480000" cy="7237403"/>
             <wp:docPr id="4" name="Picture 4"/>
             <wp:cNvGraphicFramePr>
               <a:graphicFrameLocks noChangeAspect="1"/>
@@ -1627,7 +1641,7 @@
               <a:graphicData uri="http://schemas.openxmlformats.org/drawingml/2006/picture">
                 <pic:pic>
                   <pic:nvPicPr>
-                    <pic:cNvPr id="0" name="app_running.png"/>
+                    <pic:cNvPr id="0" name="emulator_duo_tasks.png"/>
                     <pic:cNvPicPr/>
                   </pic:nvPicPr>
                   <pic:blipFill>
@@ -1639,7 +1653,7 @@
                   <pic:spPr>
                     <a:xfrm>
                       <a:off x="0" y="0"/>
-                      <a:ext cx="6480000" cy="3645000"/>
+                      <a:ext cx="6480000" cy="7237403"/>
                     </a:xfrm>
                     <a:prstGeom prst="rect"/>
                   </pic:spPr>
@@ -1658,7 +1672,7 @@
       <w:r>
         <w:drawing>
           <wp:inline xmlns:a="http://schemas.openxmlformats.org/drawingml/2006/main" xmlns:pic="http://schemas.openxmlformats.org/drawingml/2006/picture">
-            <wp:extent cx="6480000" cy="3645000"/>
+            <wp:extent cx="6480000" cy="7237403"/>
             <wp:docPr id="5" name="Picture 5"/>
             <wp:cNvGraphicFramePr>
               <a:graphicFrameLocks noChangeAspect="1"/>
@@ -1667,7 +1681,7 @@
               <a:graphicData uri="http://schemas.openxmlformats.org/drawingml/2006/picture">
                 <pic:pic>
                   <pic:nvPicPr>
-                    <pic:cNvPr id="0" name="dialog_running.png"/>
+                    <pic:cNvPr id="0" name="emulator_duo_dialogs.png"/>
                     <pic:cNvPicPr/>
                   </pic:nvPicPr>
                   <pic:blipFill>
@@ -1679,7 +1693,7 @@
                   <pic:spPr>
                     <a:xfrm>
                       <a:off x="0" y="0"/>
-                      <a:ext cx="6480000" cy="3645000"/>
+                      <a:ext cx="6480000" cy="7237403"/>
                     </a:xfrm>
                     <a:prstGeom prst="rect"/>
                   </pic:spPr>
@@ -1827,7 +1841,7 @@
           <w:b w:val="0"/>
           <w:sz w:val="28"/>
         </w:rPr>
-        <w:t>На цій лабораторній роботі я опанував процес розгортання та налаштування середовища розробки на базі Android Studio та Flutter SDK, навчився діагностувати стан системи за допомогою інструменту flutter doctor. Я створив кросплатформний мобільний проєкт під Варіант 1 («Менеджер завдань»), детально проаналізував архітектурну структуру директорій та конфігураційних файлів застосунку, успішно реалізував інтерфейс користувача з відстеженням завдань та виконав тестування і запуск програми.</w:t>
+        <w:t>На цій лабораторній роботі я опанував процес розгортання та налаштування середовища розробки на базі Android Studio та Flutter SDK, навчився діагностувати стан системи за допомогою інструменту flutter doctor. Я створив кросплатформний мобільний проєкт під Варіант 1 («Менеджер завдань»), детально проаналізував архітектурну структуру директорій та конфігураційних файлів застосунку, успішно реалізував інтерфейс користувача з відстеженням завдань, запустив та всебічно протестував його на емуляторі Android 16 (API 36).</w:t>
       </w:r>
     </w:p>
     <w:sectPr>

</xml_diff>

<commit_message>
docs(lab1): rewrite report in concise student style without bureaucratic filler
</commit_message>
<xml_diff>
--- a/Lab_1/ПМД_КН-2327Б_Багрій-Белз_ЛР-1.docx
+++ b/Lab_1/ПМД_КН-2327Б_Багрій-Белз_ЛР-1.docx
@@ -103,7 +103,7 @@
     <w:p>
       <w:pPr>
         <w:spacing w:line="276" w:lineRule="auto" w:after="0"/>
-        <w:jc w:val="center"/>
+        <w:jc w:val="both"/>
       </w:pPr>
       <w:r>
         <w:rPr>
@@ -111,21 +111,7 @@
           <w:b/>
           <w:sz w:val="28"/>
         </w:rPr>
-        <w:t>Варіант 1</w:t>
-      </w:r>
-    </w:p>
-    <w:p>
-      <w:pPr>
-        <w:spacing w:line="276" w:lineRule="auto" w:after="0"/>
-        <w:jc w:val="both"/>
-      </w:pPr>
-      <w:r>
-        <w:rPr>
-          <w:rFonts w:ascii="Times New Roman" w:hAnsi="Times New Roman" w:cs="Times New Roman"/>
-          <w:b/>
-          <w:sz w:val="28"/>
-        </w:rPr>
-        <w:t xml:space="preserve">Мета роботи: </w:t>
+        <w:t xml:space="preserve">Завдання: </w:t>
       </w:r>
       <w:r>
         <w:rPr>
@@ -133,13 +119,13 @@
           <w:b w:val="0"/>
           <w:sz w:val="28"/>
         </w:rPr>
-        <w:t>Навчитися встановлювати середовище розробки Android Studio та Flutter SDK, створювати Flutter-проєкт, аналізувати структуру застосунку та виконувати перший запуск.</w:t>
+        <w:t>Встановити Android Studio та Flutter SDK, створити Flutter-проєкт згідно Варіанту 1 («Менеджер завдань»), налаштувати емулятор та виконати запуск застосунку.</w:t>
       </w:r>
     </w:p>
     <w:p>
       <w:pPr>
         <w:spacing w:line="276" w:lineRule="auto" w:after="0"/>
-        <w:jc w:val="both"/>
+        <w:jc w:val="left"/>
       </w:pPr>
       <w:r>
         <w:rPr>
@@ -147,35 +133,1291 @@
           <w:b/>
           <w:sz w:val="28"/>
         </w:rPr>
-        <w:t xml:space="preserve">Завдання 1: </w:t>
-      </w:r>
-      <w:r>
-        <w:rPr>
-          <w:rFonts w:ascii="Times New Roman" w:hAnsi="Times New Roman" w:cs="Times New Roman"/>
-          <w:b w:val="0"/>
-          <w:sz w:val="28"/>
-        </w:rPr>
-        <w:t>Встановлення середовища Android Studio та компонентів Android SDK, Android SDK Platform та Android Virtual Device.</w:t>
+        <w:t>1 Написання коду-розв’язку завдання:</w:t>
       </w:r>
     </w:p>
     <w:p>
       <w:pPr>
-        <w:spacing w:line="276" w:lineRule="auto" w:after="0"/>
-        <w:jc w:val="both"/>
+        <w:spacing w:line="190" w:lineRule="exact" w:after="0"/>
+        <w:jc w:val="left"/>
       </w:pPr>
       <w:r>
         <w:rPr>
-          <w:rFonts w:ascii="Times New Roman" w:hAnsi="Times New Roman" w:cs="Times New Roman"/>
+          <w:rFonts w:ascii="Cascadia Mono" w:hAnsi="Cascadia Mono" w:cs="Cascadia Mono"/>
           <w:b w:val="0"/>
-          <w:sz w:val="28"/>
+          <w:sz w:val="19"/>
         </w:rPr>
-        <w:t>Для забезпечення можливості розробки та емуляції Android-застосунків було завантажено та встановлено інтегроване середовище Android Studio. Під час інсталяції та первинного налаштування SDK Manager активовано ключові компоненти платформи: Android SDK Command-line Tools, Android SDK Build-Tools версії 36.0.0, системні образи платформи Android API та утиліти керування віртуальними пристроями Android Virtual Device (AVD).</w:t>
+        <w:t>import 'package:flutter/material.dart';</w:t>
       </w:r>
     </w:p>
     <w:p>
       <w:pPr>
+        <w:spacing w:line="190" w:lineRule="exact" w:after="0"/>
+        <w:jc w:val="left"/>
+      </w:pPr>
+    </w:p>
+    <w:p>
+      <w:pPr>
+        <w:spacing w:line="190" w:lineRule="exact" w:after="0"/>
+        <w:jc w:val="left"/>
+      </w:pPr>
+      <w:r>
+        <w:rPr>
+          <w:rFonts w:ascii="Cascadia Mono" w:hAnsi="Cascadia Mono" w:cs="Cascadia Mono"/>
+          <w:b w:val="0"/>
+          <w:sz w:val="19"/>
+        </w:rPr>
+        <w:t>void main() {</w:t>
+      </w:r>
+    </w:p>
+    <w:p>
+      <w:pPr>
+        <w:spacing w:line="190" w:lineRule="exact" w:after="0"/>
+        <w:jc w:val="left"/>
+      </w:pPr>
+      <w:r>
+        <w:rPr>
+          <w:rFonts w:ascii="Cascadia Mono" w:hAnsi="Cascadia Mono" w:cs="Cascadia Mono"/>
+          <w:b w:val="0"/>
+          <w:sz w:val="19"/>
+        </w:rPr>
+        <w:t xml:space="preserve">  runApp(const TaskManagerApp());</w:t>
+      </w:r>
+    </w:p>
+    <w:p>
+      <w:pPr>
+        <w:spacing w:line="190" w:lineRule="exact" w:after="0"/>
+        <w:jc w:val="left"/>
+      </w:pPr>
+      <w:r>
+        <w:rPr>
+          <w:rFonts w:ascii="Cascadia Mono" w:hAnsi="Cascadia Mono" w:cs="Cascadia Mono"/>
+          <w:b w:val="0"/>
+          <w:sz w:val="19"/>
+        </w:rPr>
+        <w:t>}</w:t>
+      </w:r>
+    </w:p>
+    <w:p>
+      <w:pPr>
+        <w:spacing w:line="190" w:lineRule="exact" w:after="0"/>
+        <w:jc w:val="left"/>
+      </w:pPr>
+    </w:p>
+    <w:p>
+      <w:pPr>
+        <w:spacing w:line="190" w:lineRule="exact" w:after="0"/>
+        <w:jc w:val="left"/>
+      </w:pPr>
+      <w:r>
+        <w:rPr>
+          <w:rFonts w:ascii="Cascadia Mono" w:hAnsi="Cascadia Mono" w:cs="Cascadia Mono"/>
+          <w:b w:val="0"/>
+          <w:sz w:val="19"/>
+        </w:rPr>
+        <w:t>class TaskManagerApp extends StatelessWidget {</w:t>
+      </w:r>
+    </w:p>
+    <w:p>
+      <w:pPr>
+        <w:spacing w:line="190" w:lineRule="exact" w:after="0"/>
+        <w:jc w:val="left"/>
+      </w:pPr>
+      <w:r>
+        <w:rPr>
+          <w:rFonts w:ascii="Cascadia Mono" w:hAnsi="Cascadia Mono" w:cs="Cascadia Mono"/>
+          <w:b w:val="0"/>
+          <w:sz w:val="19"/>
+        </w:rPr>
+        <w:t xml:space="preserve">  const TaskManagerApp({super.key});</w:t>
+      </w:r>
+    </w:p>
+    <w:p>
+      <w:pPr>
+        <w:spacing w:line="190" w:lineRule="exact" w:after="0"/>
+        <w:jc w:val="left"/>
+      </w:pPr>
+    </w:p>
+    <w:p>
+      <w:pPr>
+        <w:spacing w:line="190" w:lineRule="exact" w:after="0"/>
+        <w:jc w:val="left"/>
+      </w:pPr>
+      <w:r>
+        <w:rPr>
+          <w:rFonts w:ascii="Cascadia Mono" w:hAnsi="Cascadia Mono" w:cs="Cascadia Mono"/>
+          <w:b w:val="0"/>
+          <w:sz w:val="19"/>
+        </w:rPr>
+        <w:t xml:space="preserve">  @override</w:t>
+      </w:r>
+    </w:p>
+    <w:p>
+      <w:pPr>
+        <w:spacing w:line="190" w:lineRule="exact" w:after="0"/>
+        <w:jc w:val="left"/>
+      </w:pPr>
+      <w:r>
+        <w:rPr>
+          <w:rFonts w:ascii="Cascadia Mono" w:hAnsi="Cascadia Mono" w:cs="Cascadia Mono"/>
+          <w:b w:val="0"/>
+          <w:sz w:val="19"/>
+        </w:rPr>
+        <w:t xml:space="preserve">  Widget build(BuildContext context) {</w:t>
+      </w:r>
+    </w:p>
+    <w:p>
+      <w:pPr>
+        <w:spacing w:line="190" w:lineRule="exact" w:after="0"/>
+        <w:jc w:val="left"/>
+      </w:pPr>
+      <w:r>
+        <w:rPr>
+          <w:rFonts w:ascii="Cascadia Mono" w:hAnsi="Cascadia Mono" w:cs="Cascadia Mono"/>
+          <w:b w:val="0"/>
+          <w:sz w:val="19"/>
+        </w:rPr>
+        <w:t xml:space="preserve">    return MaterialApp(</w:t>
+      </w:r>
+    </w:p>
+    <w:p>
+      <w:pPr>
+        <w:spacing w:line="190" w:lineRule="exact" w:after="0"/>
+        <w:jc w:val="left"/>
+      </w:pPr>
+      <w:r>
+        <w:rPr>
+          <w:rFonts w:ascii="Cascadia Mono" w:hAnsi="Cascadia Mono" w:cs="Cascadia Mono"/>
+          <w:b w:val="0"/>
+          <w:sz w:val="19"/>
+        </w:rPr>
+        <w:t xml:space="preserve">      title: 'Менеджер завдань',</w:t>
+      </w:r>
+    </w:p>
+    <w:p>
+      <w:pPr>
+        <w:spacing w:line="190" w:lineRule="exact" w:after="0"/>
+        <w:jc w:val="left"/>
+      </w:pPr>
+      <w:r>
+        <w:rPr>
+          <w:rFonts w:ascii="Cascadia Mono" w:hAnsi="Cascadia Mono" w:cs="Cascadia Mono"/>
+          <w:b w:val="0"/>
+          <w:sz w:val="19"/>
+        </w:rPr>
+        <w:t xml:space="preserve">      debugShowCheckedModeBanner: false,</w:t>
+      </w:r>
+    </w:p>
+    <w:p>
+      <w:pPr>
+        <w:spacing w:line="190" w:lineRule="exact" w:after="0"/>
+        <w:jc w:val="left"/>
+      </w:pPr>
+      <w:r>
+        <w:rPr>
+          <w:rFonts w:ascii="Cascadia Mono" w:hAnsi="Cascadia Mono" w:cs="Cascadia Mono"/>
+          <w:b w:val="0"/>
+          <w:sz w:val="19"/>
+        </w:rPr>
+        <w:t xml:space="preserve">      theme: ThemeData(</w:t>
+      </w:r>
+    </w:p>
+    <w:p>
+      <w:pPr>
+        <w:spacing w:line="190" w:lineRule="exact" w:after="0"/>
+        <w:jc w:val="left"/>
+      </w:pPr>
+      <w:r>
+        <w:rPr>
+          <w:rFonts w:ascii="Cascadia Mono" w:hAnsi="Cascadia Mono" w:cs="Cascadia Mono"/>
+          <w:b w:val="0"/>
+          <w:sz w:val="19"/>
+        </w:rPr>
+        <w:t xml:space="preserve">        useMaterial3: true,</w:t>
+      </w:r>
+    </w:p>
+    <w:p>
+      <w:pPr>
+        <w:spacing w:line="190" w:lineRule="exact" w:after="0"/>
+        <w:jc w:val="left"/>
+      </w:pPr>
+      <w:r>
+        <w:rPr>
+          <w:rFonts w:ascii="Cascadia Mono" w:hAnsi="Cascadia Mono" w:cs="Cascadia Mono"/>
+          <w:b w:val="0"/>
+          <w:sz w:val="19"/>
+        </w:rPr>
+        <w:t xml:space="preserve">        colorScheme: ColorScheme.fromSeed(</w:t>
+      </w:r>
+    </w:p>
+    <w:p>
+      <w:pPr>
+        <w:spacing w:line="190" w:lineRule="exact" w:after="0"/>
+        <w:jc w:val="left"/>
+      </w:pPr>
+      <w:r>
+        <w:rPr>
+          <w:rFonts w:ascii="Cascadia Mono" w:hAnsi="Cascadia Mono" w:cs="Cascadia Mono"/>
+          <w:b w:val="0"/>
+          <w:sz w:val="19"/>
+        </w:rPr>
+        <w:t xml:space="preserve">          seedColor: const Color(0xFFD4FF00),</w:t>
+      </w:r>
+    </w:p>
+    <w:p>
+      <w:pPr>
+        <w:spacing w:line="190" w:lineRule="exact" w:after="0"/>
+        <w:jc w:val="left"/>
+      </w:pPr>
+      <w:r>
+        <w:rPr>
+          <w:rFonts w:ascii="Cascadia Mono" w:hAnsi="Cascadia Mono" w:cs="Cascadia Mono"/>
+          <w:b w:val="0"/>
+          <w:sz w:val="19"/>
+        </w:rPr>
+        <w:t xml:space="preserve">          brightness: Brightness.dark,</w:t>
+      </w:r>
+    </w:p>
+    <w:p>
+      <w:pPr>
+        <w:spacing w:line="190" w:lineRule="exact" w:after="0"/>
+        <w:jc w:val="left"/>
+      </w:pPr>
+      <w:r>
+        <w:rPr>
+          <w:rFonts w:ascii="Cascadia Mono" w:hAnsi="Cascadia Mono" w:cs="Cascadia Mono"/>
+          <w:b w:val="0"/>
+          <w:sz w:val="19"/>
+        </w:rPr>
+        <w:t xml:space="preserve">          primary: const Color(0xFFD4FF00),</w:t>
+      </w:r>
+    </w:p>
+    <w:p>
+      <w:pPr>
+        <w:spacing w:line="190" w:lineRule="exact" w:after="0"/>
+        <w:jc w:val="left"/>
+      </w:pPr>
+      <w:r>
+        <w:rPr>
+          <w:rFonts w:ascii="Cascadia Mono" w:hAnsi="Cascadia Mono" w:cs="Cascadia Mono"/>
+          <w:b w:val="0"/>
+          <w:sz w:val="19"/>
+        </w:rPr>
+        <w:t xml:space="preserve">          surface: const Color(0xFF15181F),</w:t>
+      </w:r>
+    </w:p>
+    <w:p>
+      <w:pPr>
+        <w:spacing w:line="190" w:lineRule="exact" w:after="0"/>
+        <w:jc w:val="left"/>
+      </w:pPr>
+      <w:r>
+        <w:rPr>
+          <w:rFonts w:ascii="Cascadia Mono" w:hAnsi="Cascadia Mono" w:cs="Cascadia Mono"/>
+          <w:b w:val="0"/>
+          <w:sz w:val="19"/>
+        </w:rPr>
+        <w:t xml:space="preserve">        ),</w:t>
+      </w:r>
+    </w:p>
+    <w:p>
+      <w:pPr>
+        <w:spacing w:line="190" w:lineRule="exact" w:after="0"/>
+        <w:jc w:val="left"/>
+      </w:pPr>
+      <w:r>
+        <w:rPr>
+          <w:rFonts w:ascii="Cascadia Mono" w:hAnsi="Cascadia Mono" w:cs="Cascadia Mono"/>
+          <w:b w:val="0"/>
+          <w:sz w:val="19"/>
+        </w:rPr>
+        <w:t xml:space="preserve">        scaffoldBackgroundColor: const Color(0xFF0D0F13),</w:t>
+      </w:r>
+    </w:p>
+    <w:p>
+      <w:pPr>
+        <w:spacing w:line="190" w:lineRule="exact" w:after="0"/>
+        <w:jc w:val="left"/>
+      </w:pPr>
+      <w:r>
+        <w:rPr>
+          <w:rFonts w:ascii="Cascadia Mono" w:hAnsi="Cascadia Mono" w:cs="Cascadia Mono"/>
+          <w:b w:val="0"/>
+          <w:sz w:val="19"/>
+        </w:rPr>
+        <w:t xml:space="preserve">      ),</w:t>
+      </w:r>
+    </w:p>
+    <w:p>
+      <w:pPr>
+        <w:spacing w:line="190" w:lineRule="exact" w:after="0"/>
+        <w:jc w:val="left"/>
+      </w:pPr>
+      <w:r>
+        <w:rPr>
+          <w:rFonts w:ascii="Cascadia Mono" w:hAnsi="Cascadia Mono" w:cs="Cascadia Mono"/>
+          <w:b w:val="0"/>
+          <w:sz w:val="19"/>
+        </w:rPr>
+        <w:t xml:space="preserve">      home: const TaskManagerHomePage(title: 'Менеджер завдань'),</w:t>
+      </w:r>
+    </w:p>
+    <w:p>
+      <w:pPr>
+        <w:spacing w:line="190" w:lineRule="exact" w:after="0"/>
+        <w:jc w:val="left"/>
+      </w:pPr>
+      <w:r>
+        <w:rPr>
+          <w:rFonts w:ascii="Cascadia Mono" w:hAnsi="Cascadia Mono" w:cs="Cascadia Mono"/>
+          <w:b w:val="0"/>
+          <w:sz w:val="19"/>
+        </w:rPr>
+        <w:t xml:space="preserve">    );</w:t>
+      </w:r>
+    </w:p>
+    <w:p>
+      <w:pPr>
+        <w:spacing w:line="190" w:lineRule="exact" w:after="0"/>
+        <w:jc w:val="left"/>
+      </w:pPr>
+      <w:r>
+        <w:rPr>
+          <w:rFonts w:ascii="Cascadia Mono" w:hAnsi="Cascadia Mono" w:cs="Cascadia Mono"/>
+          <w:b w:val="0"/>
+          <w:sz w:val="19"/>
+        </w:rPr>
+        <w:t xml:space="preserve">  }</w:t>
+      </w:r>
+    </w:p>
+    <w:p>
+      <w:pPr>
+        <w:spacing w:line="190" w:lineRule="exact" w:after="0"/>
+        <w:jc w:val="left"/>
+      </w:pPr>
+      <w:r>
+        <w:rPr>
+          <w:rFonts w:ascii="Cascadia Mono" w:hAnsi="Cascadia Mono" w:cs="Cascadia Mono"/>
+          <w:b w:val="0"/>
+          <w:sz w:val="19"/>
+        </w:rPr>
+        <w:t>}</w:t>
+      </w:r>
+    </w:p>
+    <w:p>
+      <w:pPr>
+        <w:spacing w:line="190" w:lineRule="exact" w:after="0"/>
+        <w:jc w:val="left"/>
+      </w:pPr>
+    </w:p>
+    <w:p>
+      <w:pPr>
+        <w:spacing w:line="190" w:lineRule="exact" w:after="0"/>
+        <w:jc w:val="left"/>
+      </w:pPr>
+      <w:r>
+        <w:rPr>
+          <w:rFonts w:ascii="Cascadia Mono" w:hAnsi="Cascadia Mono" w:cs="Cascadia Mono"/>
+          <w:b w:val="0"/>
+          <w:sz w:val="19"/>
+        </w:rPr>
+        <w:t>class TaskItem {</w:t>
+      </w:r>
+    </w:p>
+    <w:p>
+      <w:pPr>
+        <w:spacing w:line="190" w:lineRule="exact" w:after="0"/>
+        <w:jc w:val="left"/>
+      </w:pPr>
+      <w:r>
+        <w:rPr>
+          <w:rFonts w:ascii="Cascadia Mono" w:hAnsi="Cascadia Mono" w:cs="Cascadia Mono"/>
+          <w:b w:val="0"/>
+          <w:sz w:val="19"/>
+        </w:rPr>
+        <w:t xml:space="preserve">  final String title;</w:t>
+      </w:r>
+    </w:p>
+    <w:p>
+      <w:pPr>
+        <w:spacing w:line="190" w:lineRule="exact" w:after="0"/>
+        <w:jc w:val="left"/>
+      </w:pPr>
+      <w:r>
+        <w:rPr>
+          <w:rFonts w:ascii="Cascadia Mono" w:hAnsi="Cascadia Mono" w:cs="Cascadia Mono"/>
+          <w:b w:val="0"/>
+          <w:sz w:val="19"/>
+        </w:rPr>
+        <w:t xml:space="preserve">  final String category;</w:t>
+      </w:r>
+    </w:p>
+    <w:p>
+      <w:pPr>
+        <w:spacing w:line="190" w:lineRule="exact" w:after="0"/>
+        <w:jc w:val="left"/>
+      </w:pPr>
+      <w:r>
+        <w:rPr>
+          <w:rFonts w:ascii="Cascadia Mono" w:hAnsi="Cascadia Mono" w:cs="Cascadia Mono"/>
+          <w:b w:val="0"/>
+          <w:sz w:val="19"/>
+        </w:rPr>
+        <w:t xml:space="preserve">  bool isCompleted;</w:t>
+      </w:r>
+    </w:p>
+    <w:p>
+      <w:pPr>
+        <w:spacing w:line="190" w:lineRule="exact" w:after="0"/>
+        <w:jc w:val="left"/>
+      </w:pPr>
+      <w:r>
+        <w:rPr>
+          <w:rFonts w:ascii="Cascadia Mono" w:hAnsi="Cascadia Mono" w:cs="Cascadia Mono"/>
+          <w:b w:val="0"/>
+          <w:sz w:val="19"/>
+        </w:rPr>
+        <w:t xml:space="preserve">  TaskItem({required this.title, required this.category, this.isCompleted = false});</w:t>
+      </w:r>
+    </w:p>
+    <w:p>
+      <w:pPr>
+        <w:spacing w:line="190" w:lineRule="exact" w:after="0"/>
+        <w:jc w:val="left"/>
+      </w:pPr>
+      <w:r>
+        <w:rPr>
+          <w:rFonts w:ascii="Cascadia Mono" w:hAnsi="Cascadia Mono" w:cs="Cascadia Mono"/>
+          <w:b w:val="0"/>
+          <w:sz w:val="19"/>
+        </w:rPr>
+        <w:t>}</w:t>
+      </w:r>
+    </w:p>
+    <w:p>
+      <w:pPr>
+        <w:spacing w:line="190" w:lineRule="exact" w:after="0"/>
+        <w:jc w:val="left"/>
+      </w:pPr>
+    </w:p>
+    <w:p>
+      <w:pPr>
+        <w:spacing w:line="190" w:lineRule="exact" w:after="0"/>
+        <w:jc w:val="left"/>
+      </w:pPr>
+      <w:r>
+        <w:rPr>
+          <w:rFonts w:ascii="Cascadia Mono" w:hAnsi="Cascadia Mono" w:cs="Cascadia Mono"/>
+          <w:b w:val="0"/>
+          <w:sz w:val="19"/>
+        </w:rPr>
+        <w:t>class TaskManagerHomePage extends StatefulWidget {</w:t>
+      </w:r>
+    </w:p>
+    <w:p>
+      <w:pPr>
+        <w:spacing w:line="190" w:lineRule="exact" w:after="0"/>
+        <w:jc w:val="left"/>
+      </w:pPr>
+      <w:r>
+        <w:rPr>
+          <w:rFonts w:ascii="Cascadia Mono" w:hAnsi="Cascadia Mono" w:cs="Cascadia Mono"/>
+          <w:b w:val="0"/>
+          <w:sz w:val="19"/>
+        </w:rPr>
+        <w:t xml:space="preserve">  final String title;</w:t>
+      </w:r>
+    </w:p>
+    <w:p>
+      <w:pPr>
+        <w:spacing w:line="190" w:lineRule="exact" w:after="0"/>
+        <w:jc w:val="left"/>
+      </w:pPr>
+      <w:r>
+        <w:rPr>
+          <w:rFonts w:ascii="Cascadia Mono" w:hAnsi="Cascadia Mono" w:cs="Cascadia Mono"/>
+          <w:b w:val="0"/>
+          <w:sz w:val="19"/>
+        </w:rPr>
+        <w:t xml:space="preserve">  const TaskManagerHomePage({super.key, required this.title});</w:t>
+      </w:r>
+    </w:p>
+    <w:p>
+      <w:pPr>
+        <w:spacing w:line="190" w:lineRule="exact" w:after="0"/>
+        <w:jc w:val="left"/>
+      </w:pPr>
+    </w:p>
+    <w:p>
+      <w:pPr>
+        <w:spacing w:line="190" w:lineRule="exact" w:after="0"/>
+        <w:jc w:val="left"/>
+      </w:pPr>
+      <w:r>
+        <w:rPr>
+          <w:rFonts w:ascii="Cascadia Mono" w:hAnsi="Cascadia Mono" w:cs="Cascadia Mono"/>
+          <w:b w:val="0"/>
+          <w:sz w:val="19"/>
+        </w:rPr>
+        <w:t xml:space="preserve">  @override</w:t>
+      </w:r>
+    </w:p>
+    <w:p>
+      <w:pPr>
+        <w:spacing w:line="190" w:lineRule="exact" w:after="0"/>
+        <w:jc w:val="left"/>
+      </w:pPr>
+      <w:r>
+        <w:rPr>
+          <w:rFonts w:ascii="Cascadia Mono" w:hAnsi="Cascadia Mono" w:cs="Cascadia Mono"/>
+          <w:b w:val="0"/>
+          <w:sz w:val="19"/>
+        </w:rPr>
+        <w:t xml:space="preserve">  State&lt;TaskManagerHomePage&gt; createState() =&gt; _TaskManagerHomePageState();</w:t>
+      </w:r>
+    </w:p>
+    <w:p>
+      <w:pPr>
+        <w:spacing w:line="190" w:lineRule="exact" w:after="0"/>
+        <w:jc w:val="left"/>
+      </w:pPr>
+      <w:r>
+        <w:rPr>
+          <w:rFonts w:ascii="Cascadia Mono" w:hAnsi="Cascadia Mono" w:cs="Cascadia Mono"/>
+          <w:b w:val="0"/>
+          <w:sz w:val="19"/>
+        </w:rPr>
+        <w:t>}</w:t>
+      </w:r>
+    </w:p>
+    <w:p>
+      <w:pPr>
+        <w:spacing w:line="190" w:lineRule="exact" w:after="0"/>
+        <w:jc w:val="left"/>
+      </w:pPr>
+    </w:p>
+    <w:p>
+      <w:pPr>
+        <w:spacing w:line="190" w:lineRule="exact" w:after="0"/>
+        <w:jc w:val="left"/>
+      </w:pPr>
+      <w:r>
+        <w:rPr>
+          <w:rFonts w:ascii="Cascadia Mono" w:hAnsi="Cascadia Mono" w:cs="Cascadia Mono"/>
+          <w:b w:val="0"/>
+          <w:sz w:val="19"/>
+        </w:rPr>
+        <w:t>class _TaskManagerHomePageState extends State&lt;TaskManagerHomePage&gt; {</w:t>
+      </w:r>
+    </w:p>
+    <w:p>
+      <w:pPr>
+        <w:spacing w:line="190" w:lineRule="exact" w:after="0"/>
+        <w:jc w:val="left"/>
+      </w:pPr>
+      <w:r>
+        <w:rPr>
+          <w:rFonts w:ascii="Cascadia Mono" w:hAnsi="Cascadia Mono" w:cs="Cascadia Mono"/>
+          <w:b w:val="0"/>
+          <w:sz w:val="19"/>
+        </w:rPr>
+        <w:t xml:space="preserve">  final List&lt;TaskItem&gt; _tasks = [</w:t>
+      </w:r>
+    </w:p>
+    <w:p>
+      <w:pPr>
+        <w:spacing w:line="190" w:lineRule="exact" w:after="0"/>
+        <w:jc w:val="left"/>
+      </w:pPr>
+      <w:r>
+        <w:rPr>
+          <w:rFonts w:ascii="Cascadia Mono" w:hAnsi="Cascadia Mono" w:cs="Cascadia Mono"/>
+          <w:b w:val="0"/>
+          <w:sz w:val="19"/>
+        </w:rPr>
+        <w:t xml:space="preserve">    TaskItem(title: 'Встановити Android Studio та Flutter SDK', category: 'Навчання', isCompleted: true),</w:t>
+      </w:r>
+    </w:p>
+    <w:p>
+      <w:pPr>
+        <w:spacing w:line="190" w:lineRule="exact" w:after="0"/>
+        <w:jc w:val="left"/>
+      </w:pPr>
+      <w:r>
+        <w:rPr>
+          <w:rFonts w:ascii="Cascadia Mono" w:hAnsi="Cascadia Mono" w:cs="Cascadia Mono"/>
+          <w:b w:val="0"/>
+          <w:sz w:val="19"/>
+        </w:rPr>
+        <w:t xml:space="preserve">    TaskItem(title: 'Налаштувати емулятор Android', category: 'Навчання', isCompleted: true),</w:t>
+      </w:r>
+    </w:p>
+    <w:p>
+      <w:pPr>
+        <w:spacing w:line="190" w:lineRule="exact" w:after="0"/>
+        <w:jc w:val="left"/>
+      </w:pPr>
+      <w:r>
+        <w:rPr>
+          <w:rFonts w:ascii="Cascadia Mono" w:hAnsi="Cascadia Mono" w:cs="Cascadia Mono"/>
+          <w:b w:val="0"/>
+          <w:sz w:val="19"/>
+        </w:rPr>
+        <w:t xml:space="preserve">    TaskItem(title: 'Створити Flutter-проєкт для Варіанту 1', category: 'ПМД Лаб 1', isCompleted: true),</w:t>
+      </w:r>
+    </w:p>
+    <w:p>
+      <w:pPr>
+        <w:spacing w:line="190" w:lineRule="exact" w:after="0"/>
+        <w:jc w:val="left"/>
+      </w:pPr>
+      <w:r>
+        <w:rPr>
+          <w:rFonts w:ascii="Cascadia Mono" w:hAnsi="Cascadia Mono" w:cs="Cascadia Mono"/>
+          <w:b w:val="0"/>
+          <w:sz w:val="19"/>
+        </w:rPr>
+        <w:t xml:space="preserve">    TaskItem(title: 'Оформити звіт з лабораторної роботи №1', category: 'ПМД Лаб 1', isCompleted: true),</w:t>
+      </w:r>
+    </w:p>
+    <w:p>
+      <w:pPr>
+        <w:spacing w:line="190" w:lineRule="exact" w:after="0"/>
+        <w:jc w:val="left"/>
+      </w:pPr>
+      <w:r>
+        <w:rPr>
+          <w:rFonts w:ascii="Cascadia Mono" w:hAnsi="Cascadia Mono" w:cs="Cascadia Mono"/>
+          <w:b w:val="0"/>
+          <w:sz w:val="19"/>
+        </w:rPr>
+        <w:t xml:space="preserve">    TaskItem(title: 'Підготувати відповіді на контрольні запитання', category: 'ПМД Лаб 1', isCompleted: false),</w:t>
+      </w:r>
+    </w:p>
+    <w:p>
+      <w:pPr>
+        <w:spacing w:line="190" w:lineRule="exact" w:after="0"/>
+        <w:jc w:val="left"/>
+      </w:pPr>
+      <w:r>
+        <w:rPr>
+          <w:rFonts w:ascii="Cascadia Mono" w:hAnsi="Cascadia Mono" w:cs="Cascadia Mono"/>
+          <w:b w:val="0"/>
+          <w:sz w:val="19"/>
+        </w:rPr>
+        <w:t xml:space="preserve">  ];</w:t>
+      </w:r>
+    </w:p>
+    <w:p>
+      <w:pPr>
+        <w:spacing w:line="190" w:lineRule="exact" w:after="0"/>
+        <w:jc w:val="left"/>
+      </w:pPr>
+    </w:p>
+    <w:p>
+      <w:pPr>
+        <w:spacing w:line="190" w:lineRule="exact" w:after="0"/>
+        <w:jc w:val="left"/>
+      </w:pPr>
+      <w:r>
+        <w:rPr>
+          <w:rFonts w:ascii="Cascadia Mono" w:hAnsi="Cascadia Mono" w:cs="Cascadia Mono"/>
+          <w:b w:val="0"/>
+          <w:sz w:val="19"/>
+        </w:rPr>
+        <w:t xml:space="preserve">  int get _completedCount =&gt; _tasks.where((t) =&gt; t.isCompleted).length;</w:t>
+      </w:r>
+    </w:p>
+    <w:p>
+      <w:pPr>
+        <w:spacing w:line="190" w:lineRule="exact" w:after="0"/>
+        <w:jc w:val="left"/>
+      </w:pPr>
+    </w:p>
+    <w:p>
+      <w:pPr>
+        <w:spacing w:line="190" w:lineRule="exact" w:after="0"/>
+        <w:jc w:val="left"/>
+      </w:pPr>
+      <w:r>
+        <w:rPr>
+          <w:rFonts w:ascii="Cascadia Mono" w:hAnsi="Cascadia Mono" w:cs="Cascadia Mono"/>
+          <w:b w:val="0"/>
+          <w:sz w:val="19"/>
+        </w:rPr>
+        <w:t xml:space="preserve">  void _toggleTask(int index) {</w:t>
+      </w:r>
+    </w:p>
+    <w:p>
+      <w:pPr>
+        <w:spacing w:line="190" w:lineRule="exact" w:after="0"/>
+        <w:jc w:val="left"/>
+      </w:pPr>
+      <w:r>
+        <w:rPr>
+          <w:rFonts w:ascii="Cascadia Mono" w:hAnsi="Cascadia Mono" w:cs="Cascadia Mono"/>
+          <w:b w:val="0"/>
+          <w:sz w:val="19"/>
+        </w:rPr>
+        <w:t xml:space="preserve">    setState(() {</w:t>
+      </w:r>
+    </w:p>
+    <w:p>
+      <w:pPr>
+        <w:spacing w:line="190" w:lineRule="exact" w:after="0"/>
+        <w:jc w:val="left"/>
+      </w:pPr>
+      <w:r>
+        <w:rPr>
+          <w:rFonts w:ascii="Cascadia Mono" w:hAnsi="Cascadia Mono" w:cs="Cascadia Mono"/>
+          <w:b w:val="0"/>
+          <w:sz w:val="19"/>
+        </w:rPr>
+        <w:t xml:space="preserve">      _tasks[index].isCompleted = !_tasks[index].isCompleted;</w:t>
+      </w:r>
+    </w:p>
+    <w:p>
+      <w:pPr>
+        <w:spacing w:line="190" w:lineRule="exact" w:after="0"/>
+        <w:jc w:val="left"/>
+      </w:pPr>
+      <w:r>
+        <w:rPr>
+          <w:rFonts w:ascii="Cascadia Mono" w:hAnsi="Cascadia Mono" w:cs="Cascadia Mono"/>
+          <w:b w:val="0"/>
+          <w:sz w:val="19"/>
+        </w:rPr>
+        <w:t xml:space="preserve">    });</w:t>
+      </w:r>
+    </w:p>
+    <w:p>
+      <w:pPr>
+        <w:spacing w:line="190" w:lineRule="exact" w:after="0"/>
+        <w:jc w:val="left"/>
+      </w:pPr>
+      <w:r>
+        <w:rPr>
+          <w:rFonts w:ascii="Cascadia Mono" w:hAnsi="Cascadia Mono" w:cs="Cascadia Mono"/>
+          <w:b w:val="0"/>
+          <w:sz w:val="19"/>
+        </w:rPr>
+        <w:t xml:space="preserve">  }</w:t>
+      </w:r>
+    </w:p>
+    <w:p>
+      <w:pPr>
+        <w:spacing w:line="190" w:lineRule="exact" w:after="0"/>
+        <w:jc w:val="left"/>
+      </w:pPr>
+    </w:p>
+    <w:p>
+      <w:pPr>
+        <w:spacing w:line="190" w:lineRule="exact" w:after="0"/>
+        <w:jc w:val="left"/>
+      </w:pPr>
+      <w:r>
+        <w:rPr>
+          <w:rFonts w:ascii="Cascadia Mono" w:hAnsi="Cascadia Mono" w:cs="Cascadia Mono"/>
+          <w:b w:val="0"/>
+          <w:sz w:val="19"/>
+        </w:rPr>
+        <w:t xml:space="preserve">  @override</w:t>
+      </w:r>
+    </w:p>
+    <w:p>
+      <w:pPr>
+        <w:spacing w:line="190" w:lineRule="exact" w:after="0"/>
+        <w:jc w:val="left"/>
+      </w:pPr>
+      <w:r>
+        <w:rPr>
+          <w:rFonts w:ascii="Cascadia Mono" w:hAnsi="Cascadia Mono" w:cs="Cascadia Mono"/>
+          <w:b w:val="0"/>
+          <w:sz w:val="19"/>
+        </w:rPr>
+        <w:t xml:space="preserve">  Widget build(BuildContext context) {</w:t>
+      </w:r>
+    </w:p>
+    <w:p>
+      <w:pPr>
+        <w:spacing w:line="190" w:lineRule="exact" w:after="0"/>
+        <w:jc w:val="left"/>
+      </w:pPr>
+      <w:r>
+        <w:rPr>
+          <w:rFonts w:ascii="Cascadia Mono" w:hAnsi="Cascadia Mono" w:cs="Cascadia Mono"/>
+          <w:b w:val="0"/>
+          <w:sz w:val="19"/>
+        </w:rPr>
+        <w:t xml:space="preserve">    return Scaffold(</w:t>
+      </w:r>
+    </w:p>
+    <w:p>
+      <w:pPr>
+        <w:spacing w:line="190" w:lineRule="exact" w:after="0"/>
+        <w:jc w:val="left"/>
+      </w:pPr>
+      <w:r>
+        <w:rPr>
+          <w:rFonts w:ascii="Cascadia Mono" w:hAnsi="Cascadia Mono" w:cs="Cascadia Mono"/>
+          <w:b w:val="0"/>
+          <w:sz w:val="19"/>
+        </w:rPr>
+        <w:t xml:space="preserve">      appBar: AppBar(title: Text(widget.title), centerTitle: true),</w:t>
+      </w:r>
+    </w:p>
+    <w:p>
+      <w:pPr>
+        <w:spacing w:line="190" w:lineRule="exact" w:after="0"/>
+        <w:jc w:val="left"/>
+      </w:pPr>
+      <w:r>
+        <w:rPr>
+          <w:rFonts w:ascii="Cascadia Mono" w:hAnsi="Cascadia Mono" w:cs="Cascadia Mono"/>
+          <w:b w:val="0"/>
+          <w:sz w:val="19"/>
+        </w:rPr>
+        <w:t xml:space="preserve">      body: Padding(</w:t>
+      </w:r>
+    </w:p>
+    <w:p>
+      <w:pPr>
+        <w:spacing w:line="190" w:lineRule="exact" w:after="0"/>
+        <w:jc w:val="left"/>
+      </w:pPr>
+      <w:r>
+        <w:rPr>
+          <w:rFonts w:ascii="Cascadia Mono" w:hAnsi="Cascadia Mono" w:cs="Cascadia Mono"/>
+          <w:b w:val="0"/>
+          <w:sz w:val="19"/>
+        </w:rPr>
+        <w:t xml:space="preserve">        padding: const EdgeInsets.all(16.0),</w:t>
+      </w:r>
+    </w:p>
+    <w:p>
+      <w:pPr>
+        <w:spacing w:line="190" w:lineRule="exact" w:after="0"/>
+        <w:jc w:val="left"/>
+      </w:pPr>
+      <w:r>
+        <w:rPr>
+          <w:rFonts w:ascii="Cascadia Mono" w:hAnsi="Cascadia Mono" w:cs="Cascadia Mono"/>
+          <w:b w:val="0"/>
+          <w:sz w:val="19"/>
+        </w:rPr>
+        <w:t xml:space="preserve">        child: Column(</w:t>
+      </w:r>
+    </w:p>
+    <w:p>
+      <w:pPr>
+        <w:spacing w:line="190" w:lineRule="exact" w:after="0"/>
+        <w:jc w:val="left"/>
+      </w:pPr>
+      <w:r>
+        <w:rPr>
+          <w:rFonts w:ascii="Cascadia Mono" w:hAnsi="Cascadia Mono" w:cs="Cascadia Mono"/>
+          <w:b w:val="0"/>
+          <w:sz w:val="19"/>
+        </w:rPr>
+        <w:t xml:space="preserve">          children: [</w:t>
+      </w:r>
+    </w:p>
+    <w:p>
+      <w:pPr>
+        <w:spacing w:line="190" w:lineRule="exact" w:after="0"/>
+        <w:jc w:val="left"/>
+      </w:pPr>
+      <w:r>
+        <w:rPr>
+          <w:rFonts w:ascii="Cascadia Mono" w:hAnsi="Cascadia Mono" w:cs="Cascadia Mono"/>
+          <w:b w:val="0"/>
+          <w:sz w:val="19"/>
+        </w:rPr>
+        <w:t xml:space="preserve">            Text('Варіант 1: Менеджер завдань ($_completedCount / ${_tasks.length})'),</w:t>
+      </w:r>
+    </w:p>
+    <w:p>
+      <w:pPr>
+        <w:spacing w:line="190" w:lineRule="exact" w:after="0"/>
+        <w:jc w:val="left"/>
+      </w:pPr>
+      <w:r>
+        <w:rPr>
+          <w:rFonts w:ascii="Cascadia Mono" w:hAnsi="Cascadia Mono" w:cs="Cascadia Mono"/>
+          <w:b w:val="0"/>
+          <w:sz w:val="19"/>
+        </w:rPr>
+        <w:t xml:space="preserve">            const SizedBox(height: 10),</w:t>
+      </w:r>
+    </w:p>
+    <w:p>
+      <w:pPr>
+        <w:spacing w:line="190" w:lineRule="exact" w:after="0"/>
+        <w:jc w:val="left"/>
+      </w:pPr>
+      <w:r>
+        <w:rPr>
+          <w:rFonts w:ascii="Cascadia Mono" w:hAnsi="Cascadia Mono" w:cs="Cascadia Mono"/>
+          <w:b w:val="0"/>
+          <w:sz w:val="19"/>
+        </w:rPr>
+        <w:t xml:space="preserve">            Expanded(</w:t>
+      </w:r>
+    </w:p>
+    <w:p>
+      <w:pPr>
+        <w:spacing w:line="190" w:lineRule="exact" w:after="0"/>
+        <w:jc w:val="left"/>
+      </w:pPr>
+      <w:r>
+        <w:rPr>
+          <w:rFonts w:ascii="Cascadia Mono" w:hAnsi="Cascadia Mono" w:cs="Cascadia Mono"/>
+          <w:b w:val="0"/>
+          <w:sz w:val="19"/>
+        </w:rPr>
+        <w:t xml:space="preserve">              child: ListView.builder(</w:t>
+      </w:r>
+    </w:p>
+    <w:p>
+      <w:pPr>
+        <w:spacing w:line="190" w:lineRule="exact" w:after="0"/>
+        <w:jc w:val="left"/>
+      </w:pPr>
+      <w:r>
+        <w:rPr>
+          <w:rFonts w:ascii="Cascadia Mono" w:hAnsi="Cascadia Mono" w:cs="Cascadia Mono"/>
+          <w:b w:val="0"/>
+          <w:sz w:val="19"/>
+        </w:rPr>
+        <w:t xml:space="preserve">                itemCount: _tasks.length,</w:t>
+      </w:r>
+    </w:p>
+    <w:p>
+      <w:pPr>
+        <w:spacing w:line="190" w:lineRule="exact" w:after="0"/>
+        <w:jc w:val="left"/>
+      </w:pPr>
+      <w:r>
+        <w:rPr>
+          <w:rFonts w:ascii="Cascadia Mono" w:hAnsi="Cascadia Mono" w:cs="Cascadia Mono"/>
+          <w:b w:val="0"/>
+          <w:sz w:val="19"/>
+        </w:rPr>
+        <w:t xml:space="preserve">                itemBuilder: (context, i) =&gt; Card(</w:t>
+      </w:r>
+    </w:p>
+    <w:p>
+      <w:pPr>
+        <w:spacing w:line="190" w:lineRule="exact" w:after="0"/>
+        <w:jc w:val="left"/>
+      </w:pPr>
+      <w:r>
+        <w:rPr>
+          <w:rFonts w:ascii="Cascadia Mono" w:hAnsi="Cascadia Mono" w:cs="Cascadia Mono"/>
+          <w:b w:val="0"/>
+          <w:sz w:val="19"/>
+        </w:rPr>
+        <w:t xml:space="preserve">                  child: ListTile(</w:t>
+      </w:r>
+    </w:p>
+    <w:p>
+      <w:pPr>
+        <w:spacing w:line="190" w:lineRule="exact" w:after="0"/>
+        <w:jc w:val="left"/>
+      </w:pPr>
+      <w:r>
+        <w:rPr>
+          <w:rFonts w:ascii="Cascadia Mono" w:hAnsi="Cascadia Mono" w:cs="Cascadia Mono"/>
+          <w:b w:val="0"/>
+          <w:sz w:val="19"/>
+        </w:rPr>
+        <w:t xml:space="preserve">                    leading: Checkbox(value: _tasks[i].isCompleted, onChanged: (_) =&gt; _toggleTask(i)),</w:t>
+      </w:r>
+    </w:p>
+    <w:p>
+      <w:pPr>
+        <w:spacing w:line="190" w:lineRule="exact" w:after="0"/>
+        <w:jc w:val="left"/>
+      </w:pPr>
+      <w:r>
+        <w:rPr>
+          <w:rFonts w:ascii="Cascadia Mono" w:hAnsi="Cascadia Mono" w:cs="Cascadia Mono"/>
+          <w:b w:val="0"/>
+          <w:sz w:val="19"/>
+        </w:rPr>
+        <w:t xml:space="preserve">                    title: Text(_tasks[i].title),</w:t>
+      </w:r>
+    </w:p>
+    <w:p>
+      <w:pPr>
+        <w:spacing w:line="190" w:lineRule="exact" w:after="0"/>
+        <w:jc w:val="left"/>
+      </w:pPr>
+      <w:r>
+        <w:rPr>
+          <w:rFonts w:ascii="Cascadia Mono" w:hAnsi="Cascadia Mono" w:cs="Cascadia Mono"/>
+          <w:b w:val="0"/>
+          <w:sz w:val="19"/>
+        </w:rPr>
+        <w:t xml:space="preserve">                    subtitle: Text(_tasks[i].category),</w:t>
+      </w:r>
+    </w:p>
+    <w:p>
+      <w:pPr>
+        <w:spacing w:line="190" w:lineRule="exact" w:after="0"/>
+        <w:jc w:val="left"/>
+      </w:pPr>
+      <w:r>
+        <w:rPr>
+          <w:rFonts w:ascii="Cascadia Mono" w:hAnsi="Cascadia Mono" w:cs="Cascadia Mono"/>
+          <w:b w:val="0"/>
+          <w:sz w:val="19"/>
+        </w:rPr>
+        <w:t xml:space="preserve">                  ),</w:t>
+      </w:r>
+    </w:p>
+    <w:p>
+      <w:pPr>
+        <w:spacing w:line="190" w:lineRule="exact" w:after="0"/>
+        <w:jc w:val="left"/>
+      </w:pPr>
+      <w:r>
+        <w:rPr>
+          <w:rFonts w:ascii="Cascadia Mono" w:hAnsi="Cascadia Mono" w:cs="Cascadia Mono"/>
+          <w:b w:val="0"/>
+          <w:sz w:val="19"/>
+        </w:rPr>
+        <w:t xml:space="preserve">                ),</w:t>
+      </w:r>
+    </w:p>
+    <w:p>
+      <w:pPr>
+        <w:spacing w:line="190" w:lineRule="exact" w:after="0"/>
+        <w:jc w:val="left"/>
+      </w:pPr>
+      <w:r>
+        <w:rPr>
+          <w:rFonts w:ascii="Cascadia Mono" w:hAnsi="Cascadia Mono" w:cs="Cascadia Mono"/>
+          <w:b w:val="0"/>
+          <w:sz w:val="19"/>
+        </w:rPr>
+        <w:t xml:space="preserve">              ),</w:t>
+      </w:r>
+    </w:p>
+    <w:p>
+      <w:pPr>
+        <w:spacing w:line="190" w:lineRule="exact" w:after="0"/>
+        <w:jc w:val="left"/>
+      </w:pPr>
+      <w:r>
+        <w:rPr>
+          <w:rFonts w:ascii="Cascadia Mono" w:hAnsi="Cascadia Mono" w:cs="Cascadia Mono"/>
+          <w:b w:val="0"/>
+          <w:sz w:val="19"/>
+        </w:rPr>
+        <w:t xml:space="preserve">            ),</w:t>
+      </w:r>
+    </w:p>
+    <w:p>
+      <w:pPr>
+        <w:spacing w:line="190" w:lineRule="exact" w:after="0"/>
+        <w:jc w:val="left"/>
+      </w:pPr>
+      <w:r>
+        <w:rPr>
+          <w:rFonts w:ascii="Cascadia Mono" w:hAnsi="Cascadia Mono" w:cs="Cascadia Mono"/>
+          <w:b w:val="0"/>
+          <w:sz w:val="19"/>
+        </w:rPr>
+        <w:t xml:space="preserve">          ],</w:t>
+      </w:r>
+    </w:p>
+    <w:p>
+      <w:pPr>
+        <w:spacing w:line="190" w:lineRule="exact" w:after="0"/>
+        <w:jc w:val="left"/>
+      </w:pPr>
+      <w:r>
+        <w:rPr>
+          <w:rFonts w:ascii="Cascadia Mono" w:hAnsi="Cascadia Mono" w:cs="Cascadia Mono"/>
+          <w:b w:val="0"/>
+          <w:sz w:val="19"/>
+        </w:rPr>
+        <w:t xml:space="preserve">        ),</w:t>
+      </w:r>
+    </w:p>
+    <w:p>
+      <w:pPr>
+        <w:spacing w:line="190" w:lineRule="exact" w:after="0"/>
+        <w:jc w:val="left"/>
+      </w:pPr>
+      <w:r>
+        <w:rPr>
+          <w:rFonts w:ascii="Cascadia Mono" w:hAnsi="Cascadia Mono" w:cs="Cascadia Mono"/>
+          <w:b w:val="0"/>
+          <w:sz w:val="19"/>
+        </w:rPr>
+        <w:t xml:space="preserve">      ),</w:t>
+      </w:r>
+    </w:p>
+    <w:p>
+      <w:pPr>
+        <w:spacing w:line="190" w:lineRule="exact" w:after="0"/>
+        <w:jc w:val="left"/>
+      </w:pPr>
+      <w:r>
+        <w:rPr>
+          <w:rFonts w:ascii="Cascadia Mono" w:hAnsi="Cascadia Mono" w:cs="Cascadia Mono"/>
+          <w:b w:val="0"/>
+          <w:sz w:val="19"/>
+        </w:rPr>
+        <w:t xml:space="preserve">      floatingActionButtonLocation: FloatingActionButtonLocation.centerFloat,</w:t>
+      </w:r>
+    </w:p>
+    <w:p>
+      <w:pPr>
+        <w:spacing w:line="190" w:lineRule="exact" w:after="0"/>
+        <w:jc w:val="left"/>
+      </w:pPr>
+      <w:r>
+        <w:rPr>
+          <w:rFonts w:ascii="Cascadia Mono" w:hAnsi="Cascadia Mono" w:cs="Cascadia Mono"/>
+          <w:b w:val="0"/>
+          <w:sz w:val="19"/>
+        </w:rPr>
+        <w:t xml:space="preserve">      floatingActionButton: FloatingActionButton.extended(</w:t>
+      </w:r>
+    </w:p>
+    <w:p>
+      <w:pPr>
+        <w:spacing w:line="190" w:lineRule="exact" w:after="0"/>
+        <w:jc w:val="left"/>
+      </w:pPr>
+      <w:r>
+        <w:rPr>
+          <w:rFonts w:ascii="Cascadia Mono" w:hAnsi="Cascadia Mono" w:cs="Cascadia Mono"/>
+          <w:b w:val="0"/>
+          <w:sz w:val="19"/>
+        </w:rPr>
+        <w:t xml:space="preserve">        onPressed: () {},</w:t>
+      </w:r>
+    </w:p>
+    <w:p>
+      <w:pPr>
+        <w:spacing w:line="190" w:lineRule="exact" w:after="0"/>
+        <w:jc w:val="left"/>
+      </w:pPr>
+      <w:r>
+        <w:rPr>
+          <w:rFonts w:ascii="Cascadia Mono" w:hAnsi="Cascadia Mono" w:cs="Cascadia Mono"/>
+          <w:b w:val="0"/>
+          <w:sz w:val="19"/>
+        </w:rPr>
+        <w:t xml:space="preserve">        backgroundColor: const Color(0xFFD4FF00),</w:t>
+      </w:r>
+    </w:p>
+    <w:p>
+      <w:pPr>
+        <w:spacing w:line="190" w:lineRule="exact" w:after="0"/>
+        <w:jc w:val="left"/>
+      </w:pPr>
+      <w:r>
+        <w:rPr>
+          <w:rFonts w:ascii="Cascadia Mono" w:hAnsi="Cascadia Mono" w:cs="Cascadia Mono"/>
+          <w:b w:val="0"/>
+          <w:sz w:val="19"/>
+        </w:rPr>
+        <w:t xml:space="preserve">        foregroundColor: const Color(0xFF0B0D11),</w:t>
+      </w:r>
+    </w:p>
+    <w:p>
+      <w:pPr>
+        <w:spacing w:line="190" w:lineRule="exact" w:after="0"/>
+        <w:jc w:val="left"/>
+      </w:pPr>
+      <w:r>
+        <w:rPr>
+          <w:rFonts w:ascii="Cascadia Mono" w:hAnsi="Cascadia Mono" w:cs="Cascadia Mono"/>
+          <w:b w:val="0"/>
+          <w:sz w:val="19"/>
+        </w:rPr>
+        <w:t xml:space="preserve">        icon: const Icon(Icons.add),</w:t>
+      </w:r>
+    </w:p>
+    <w:p>
+      <w:pPr>
+        <w:spacing w:line="190" w:lineRule="exact" w:after="0"/>
+        <w:jc w:val="left"/>
+      </w:pPr>
+      <w:r>
+        <w:rPr>
+          <w:rFonts w:ascii="Cascadia Mono" w:hAnsi="Cascadia Mono" w:cs="Cascadia Mono"/>
+          <w:b w:val="0"/>
+          <w:sz w:val="19"/>
+        </w:rPr>
+        <w:t xml:space="preserve">        label: const Text('Додати завдання'),</w:t>
+      </w:r>
+    </w:p>
+    <w:p>
+      <w:pPr>
+        <w:spacing w:line="190" w:lineRule="exact" w:after="0"/>
+        <w:jc w:val="left"/>
+      </w:pPr>
+      <w:r>
+        <w:rPr>
+          <w:rFonts w:ascii="Cascadia Mono" w:hAnsi="Cascadia Mono" w:cs="Cascadia Mono"/>
+          <w:b w:val="0"/>
+          <w:sz w:val="19"/>
+        </w:rPr>
+        <w:t xml:space="preserve">      ),</w:t>
+      </w:r>
+    </w:p>
+    <w:p>
+      <w:pPr>
+        <w:spacing w:line="190" w:lineRule="exact" w:after="0"/>
+        <w:jc w:val="left"/>
+      </w:pPr>
+      <w:r>
+        <w:rPr>
+          <w:rFonts w:ascii="Cascadia Mono" w:hAnsi="Cascadia Mono" w:cs="Cascadia Mono"/>
+          <w:b w:val="0"/>
+          <w:sz w:val="19"/>
+        </w:rPr>
+        <w:t xml:space="preserve">    );</w:t>
+      </w:r>
+    </w:p>
+    <w:p>
+      <w:pPr>
+        <w:spacing w:line="190" w:lineRule="exact" w:after="0"/>
+        <w:jc w:val="left"/>
+      </w:pPr>
+      <w:r>
+        <w:rPr>
+          <w:rFonts w:ascii="Cascadia Mono" w:hAnsi="Cascadia Mono" w:cs="Cascadia Mono"/>
+          <w:b w:val="0"/>
+          <w:sz w:val="19"/>
+        </w:rPr>
+        <w:t xml:space="preserve">  }</w:t>
+      </w:r>
+    </w:p>
+    <w:p>
+      <w:pPr>
+        <w:spacing w:line="190" w:lineRule="exact" w:after="0"/>
+        <w:jc w:val="left"/>
+      </w:pPr>
+      <w:r>
+        <w:rPr>
+          <w:rFonts w:ascii="Cascadia Mono" w:hAnsi="Cascadia Mono" w:cs="Cascadia Mono"/>
+          <w:b w:val="0"/>
+          <w:sz w:val="19"/>
+        </w:rPr>
+        <w:t>}</w:t>
+      </w:r>
+    </w:p>
+    <w:p>
+      <w:pPr>
         <w:spacing w:line="276" w:lineRule="auto" w:after="0"/>
-        <w:jc w:val="both"/>
+        <w:jc w:val="left"/>
       </w:pPr>
       <w:r>
         <w:rPr>
@@ -183,43 +1425,7 @@
           <w:b/>
           <w:sz w:val="28"/>
         </w:rPr>
-        <w:t xml:space="preserve">Завдання 2: </w:t>
-      </w:r>
-      <w:r>
-        <w:rPr>
-          <w:rFonts w:ascii="Times New Roman" w:hAnsi="Times New Roman" w:cs="Times New Roman"/>
-          <w:b w:val="0"/>
-          <w:sz w:val="28"/>
-        </w:rPr>
-        <w:t>Встановлення Flutter SDK та верифікація конфігурації утилітою flutter doctor.</w:t>
-      </w:r>
-    </w:p>
-    <w:p>
-      <w:pPr>
-        <w:spacing w:line="276" w:lineRule="auto" w:after="0"/>
-        <w:jc w:val="both"/>
-      </w:pPr>
-      <w:r>
-        <w:rPr>
-          <w:rFonts w:ascii="Times New Roman" w:hAnsi="Times New Roman" w:cs="Times New Roman"/>
-          <w:b w:val="0"/>
-          <w:sz w:val="28"/>
-        </w:rPr>
-        <w:t>Завантажено стабільний дистрибутив Flutter SDK (Channel stable, версія 3.47.2) та додано виконуваний шлях до системної змінної PATH. Коректність встановлення всіх компіляторів, лінкерів, Android toolchain, Visual Studio C++ toolchain та підключених пристроїв перевірено командою flutter doctor.</w:t>
-      </w:r>
-    </w:p>
-    <w:p>
-      <w:pPr>
-        <w:spacing w:line="276" w:lineRule="auto" w:after="0"/>
-        <w:jc w:val="left"/>
-      </w:pPr>
-      <w:r>
-        <w:rPr>
-          <w:rFonts w:ascii="Times New Roman" w:hAnsi="Times New Roman" w:cs="Times New Roman"/>
-          <w:b/>
-          <w:sz w:val="28"/>
-        </w:rPr>
-        <w:t>Діагностика робочого середовища (flutter doctor):</w:t>
+        <w:t>2 Результат виконання коду:</w:t>
       </w:r>
     </w:p>
     <w:p>
@@ -264,1368 +1470,6 @@
     </w:p>
     <w:p>
       <w:pPr>
-        <w:spacing w:line="276" w:lineRule="auto" w:after="0"/>
-        <w:jc w:val="both"/>
-      </w:pPr>
-      <w:r>
-        <w:rPr>
-          <w:rFonts w:ascii="Times New Roman" w:hAnsi="Times New Roman" w:cs="Times New Roman"/>
-          <w:b/>
-          <w:sz w:val="28"/>
-        </w:rPr>
-        <w:t xml:space="preserve">Завдання 3: </w:t>
-      </w:r>
-      <w:r>
-        <w:rPr>
-          <w:rFonts w:ascii="Times New Roman" w:hAnsi="Times New Roman" w:cs="Times New Roman"/>
-          <w:b w:val="0"/>
-          <w:sz w:val="28"/>
-        </w:rPr>
-        <w:t>Створення Flutter-проєкту для Варіанту 1 («Менеджер завдань») та аналіз файлової структури.</w:t>
-      </w:r>
-    </w:p>
-    <w:p>
-      <w:pPr>
-        <w:spacing w:line="276" w:lineRule="auto" w:after="0"/>
-        <w:jc w:val="both"/>
-      </w:pPr>
-      <w:r>
-        <w:rPr>
-          <w:rFonts w:ascii="Times New Roman" w:hAnsi="Times New Roman" w:cs="Times New Roman"/>
-          <w:b w:val="0"/>
-          <w:sz w:val="28"/>
-        </w:rPr>
-        <w:t>Створено новий Flutter-проєкт за допомогою команди: flutter create task_manager --org com.taskmaster --project-name task_manager. Відповідно до вимог варіанту, назва проєкту task_manager записана у нижньому регістрі з нижнім підкресленням. Досліджено призначення ключових каталогів застосунку:</w:t>
-        <w:br/>
-        <w:t>• android/ — містить специфічний код для Android, маніфест AndroidManifest.xml та конфігурації Gradle (build.gradle.kts);</w:t>
-        <w:br/>
-        <w:t>• ios/ — каталог з нативним проєктом для Apple iOS та файлами конфігурації Xcode;</w:t>
-        <w:br/>
-        <w:t>• windows/ та web/ — конфігурації для збірки нативних настільних (C++) та веб-застосунків;</w:t>
-        <w:br/>
-        <w:t>• lib/ — основний робочий каталог із вихідним кодом мовою Dart (точка входу main.dart);</w:t>
-        <w:br/>
-        <w:t>• test/ — модульні та віджет-тести для автоматизованої перевірки працездатності;</w:t>
-        <w:br/>
-        <w:t>• pubspec.yaml — конфігураційний файл пакета: назва, версія, зовнішні залежності, шрифти та асети.</w:t>
-      </w:r>
-    </w:p>
-    <w:p>
-      <w:pPr>
-        <w:spacing w:line="276" w:lineRule="auto" w:after="0"/>
-        <w:jc w:val="left"/>
-      </w:pPr>
-      <w:r>
-        <w:rPr>
-          <w:rFonts w:ascii="Times New Roman" w:hAnsi="Times New Roman" w:cs="Times New Roman"/>
-          <w:b/>
-          <w:sz w:val="28"/>
-        </w:rPr>
-        <w:t>Ієрархія файлів та директорій створеного проєкту:</w:t>
-      </w:r>
-    </w:p>
-    <w:p>
-      <w:pPr>
-        <w:spacing w:after="0"/>
-        <w:jc w:val="center"/>
-      </w:pPr>
-      <w:r>
-        <w:drawing>
-          <wp:inline xmlns:a="http://schemas.openxmlformats.org/drawingml/2006/main" xmlns:pic="http://schemas.openxmlformats.org/drawingml/2006/picture">
-            <wp:extent cx="6480000" cy="2004750"/>
-            <wp:docPr id="2" name="Picture 2"/>
-            <wp:cNvGraphicFramePr>
-              <a:graphicFrameLocks noChangeAspect="1"/>
-            </wp:cNvGraphicFramePr>
-            <a:graphic>
-              <a:graphicData uri="http://schemas.openxmlformats.org/drawingml/2006/picture">
-                <pic:pic>
-                  <pic:nvPicPr>
-                    <pic:cNvPr id="0" name="tree_terminal.png"/>
-                    <pic:cNvPicPr/>
-                  </pic:nvPicPr>
-                  <pic:blipFill>
-                    <a:blip r:embed="rId10"/>
-                    <a:stretch>
-                      <a:fillRect/>
-                    </a:stretch>
-                  </pic:blipFill>
-                  <pic:spPr>
-                    <a:xfrm>
-                      <a:off x="0" y="0"/>
-                      <a:ext cx="6480000" cy="2004750"/>
-                    </a:xfrm>
-                    <a:prstGeom prst="rect"/>
-                  </pic:spPr>
-                </pic:pic>
-              </a:graphicData>
-            </a:graphic>
-          </wp:inline>
-        </w:drawing>
-      </w:r>
-    </w:p>
-    <w:p>
-      <w:pPr>
-        <w:spacing w:line="276" w:lineRule="auto" w:after="0"/>
-        <w:jc w:val="both"/>
-      </w:pPr>
-      <w:r>
-        <w:rPr>
-          <w:rFonts w:ascii="Times New Roman" w:hAnsi="Times New Roman" w:cs="Times New Roman"/>
-          <w:b/>
-          <w:sz w:val="28"/>
-        </w:rPr>
-        <w:t xml:space="preserve">Завдання 4: </w:t>
-      </w:r>
-      <w:r>
-        <w:rPr>
-          <w:rFonts w:ascii="Times New Roman" w:hAnsi="Times New Roman" w:cs="Times New Roman"/>
-          <w:b w:val="0"/>
-          <w:sz w:val="28"/>
-        </w:rPr>
-        <w:t>Налаштування емулятора Android Virtual Device (AVD) та тестування оточення.</w:t>
-      </w:r>
-    </w:p>
-    <w:p>
-      <w:pPr>
-        <w:spacing w:line="276" w:lineRule="auto" w:after="0"/>
-        <w:jc w:val="both"/>
-      </w:pPr>
-      <w:r>
-        <w:rPr>
-          <w:rFonts w:ascii="Times New Roman" w:hAnsi="Times New Roman" w:cs="Times New Roman"/>
-          <w:b w:val="0"/>
-          <w:sz w:val="28"/>
-        </w:rPr>
-        <w:t>У Device Manager середовища Android Studio налаштовано віртуальний емулятор пристрою Google Android (профіль lab20, sdk gphone64 x86_64, Android 16 / API 36). Виконано запуск емулятора, перевірку його готовності в списку підключених пристроїв та тестування віджетів.</w:t>
-      </w:r>
-    </w:p>
-    <w:p>
-      <w:pPr>
-        <w:spacing w:line="276" w:lineRule="auto" w:after="0"/>
-        <w:jc w:val="left"/>
-      </w:pPr>
-      <w:r>
-        <w:rPr>
-          <w:rFonts w:ascii="Times New Roman" w:hAnsi="Times New Roman" w:cs="Times New Roman"/>
-          <w:b/>
-          <w:sz w:val="28"/>
-        </w:rPr>
-        <w:t>Статус емулятора та проходження тестів (flutter test):</w:t>
-      </w:r>
-    </w:p>
-    <w:p>
-      <w:pPr>
-        <w:spacing w:after="0"/>
-        <w:jc w:val="center"/>
-      </w:pPr>
-      <w:r>
-        <w:drawing>
-          <wp:inline xmlns:a="http://schemas.openxmlformats.org/drawingml/2006/main" xmlns:pic="http://schemas.openxmlformats.org/drawingml/2006/picture">
-            <wp:extent cx="6480000" cy="1559250"/>
-            <wp:docPr id="3" name="Picture 3"/>
-            <wp:cNvGraphicFramePr>
-              <a:graphicFrameLocks noChangeAspect="1"/>
-            </wp:cNvGraphicFramePr>
-            <a:graphic>
-              <a:graphicData uri="http://schemas.openxmlformats.org/drawingml/2006/picture">
-                <pic:pic>
-                  <pic:nvPicPr>
-                    <pic:cNvPr id="0" name="emulator_terminal.png"/>
-                    <pic:cNvPicPr/>
-                  </pic:nvPicPr>
-                  <pic:blipFill>
-                    <a:blip r:embed="rId11"/>
-                    <a:stretch>
-                      <a:fillRect/>
-                    </a:stretch>
-                  </pic:blipFill>
-                  <pic:spPr>
-                    <a:xfrm>
-                      <a:off x="0" y="0"/>
-                      <a:ext cx="6480000" cy="1559250"/>
-                    </a:xfrm>
-                    <a:prstGeom prst="rect"/>
-                  </pic:spPr>
-                </pic:pic>
-              </a:graphicData>
-            </a:graphic>
-          </wp:inline>
-        </w:drawing>
-      </w:r>
-    </w:p>
-    <w:p>
-      <w:pPr>
-        <w:spacing w:line="276" w:lineRule="auto" w:after="0"/>
-        <w:jc w:val="both"/>
-      </w:pPr>
-      <w:r>
-        <w:rPr>
-          <w:rFonts w:ascii="Times New Roman" w:hAnsi="Times New Roman" w:cs="Times New Roman"/>
-          <w:b/>
-          <w:sz w:val="28"/>
-        </w:rPr>
-        <w:t xml:space="preserve">Завдання 5: </w:t>
-      </w:r>
-      <w:r>
-        <w:rPr>
-          <w:rFonts w:ascii="Times New Roman" w:hAnsi="Times New Roman" w:cs="Times New Roman"/>
-          <w:b w:val="0"/>
-          <w:sz w:val="28"/>
-        </w:rPr>
-        <w:t>Розробка інтерфейсу застосунку «Менеджер завдань» (Варіант 1) та запуск на Android-емуляторі.</w:t>
-      </w:r>
-    </w:p>
-    <w:p>
-      <w:pPr>
-        <w:spacing w:line="276" w:lineRule="auto" w:after="0"/>
-        <w:jc w:val="left"/>
-      </w:pPr>
-      <w:r>
-        <w:rPr>
-          <w:rFonts w:ascii="Times New Roman" w:hAnsi="Times New Roman" w:cs="Times New Roman"/>
-          <w:b/>
-          <w:sz w:val="28"/>
-        </w:rPr>
-        <w:t>1. Написання вихідного коду головного файлу (lib/main.dart):</w:t>
-      </w:r>
-    </w:p>
-    <w:p>
-      <w:pPr>
-        <w:spacing w:line="190" w:lineRule="exact" w:after="0"/>
-        <w:jc w:val="left"/>
-      </w:pPr>
-      <w:r>
-        <w:rPr>
-          <w:rFonts w:ascii="Cascadia Mono" w:hAnsi="Cascadia Mono" w:cs="Cascadia Mono"/>
-          <w:b w:val="0"/>
-          <w:sz w:val="19"/>
-        </w:rPr>
-        <w:t>import 'package:flutter/material.dart';</w:t>
-      </w:r>
-    </w:p>
-    <w:p>
-      <w:pPr>
-        <w:spacing w:line="190" w:lineRule="exact" w:after="0"/>
-        <w:jc w:val="left"/>
-      </w:pPr>
-    </w:p>
-    <w:p>
-      <w:pPr>
-        <w:spacing w:line="190" w:lineRule="exact" w:after="0"/>
-        <w:jc w:val="left"/>
-      </w:pPr>
-      <w:r>
-        <w:rPr>
-          <w:rFonts w:ascii="Cascadia Mono" w:hAnsi="Cascadia Mono" w:cs="Cascadia Mono"/>
-          <w:b w:val="0"/>
-          <w:sz w:val="19"/>
-        </w:rPr>
-        <w:t>void main() {</w:t>
-      </w:r>
-    </w:p>
-    <w:p>
-      <w:pPr>
-        <w:spacing w:line="190" w:lineRule="exact" w:after="0"/>
-        <w:jc w:val="left"/>
-      </w:pPr>
-      <w:r>
-        <w:rPr>
-          <w:rFonts w:ascii="Cascadia Mono" w:hAnsi="Cascadia Mono" w:cs="Cascadia Mono"/>
-          <w:b w:val="0"/>
-          <w:sz w:val="19"/>
-        </w:rPr>
-        <w:t xml:space="preserve">  runApp(const TaskManagerApp());</w:t>
-      </w:r>
-    </w:p>
-    <w:p>
-      <w:pPr>
-        <w:spacing w:line="190" w:lineRule="exact" w:after="0"/>
-        <w:jc w:val="left"/>
-      </w:pPr>
-      <w:r>
-        <w:rPr>
-          <w:rFonts w:ascii="Cascadia Mono" w:hAnsi="Cascadia Mono" w:cs="Cascadia Mono"/>
-          <w:b w:val="0"/>
-          <w:sz w:val="19"/>
-        </w:rPr>
-        <w:t>}</w:t>
-      </w:r>
-    </w:p>
-    <w:p>
-      <w:pPr>
-        <w:spacing w:line="190" w:lineRule="exact" w:after="0"/>
-        <w:jc w:val="left"/>
-      </w:pPr>
-    </w:p>
-    <w:p>
-      <w:pPr>
-        <w:spacing w:line="190" w:lineRule="exact" w:after="0"/>
-        <w:jc w:val="left"/>
-      </w:pPr>
-      <w:r>
-        <w:rPr>
-          <w:rFonts w:ascii="Cascadia Mono" w:hAnsi="Cascadia Mono" w:cs="Cascadia Mono"/>
-          <w:b w:val="0"/>
-          <w:sz w:val="19"/>
-        </w:rPr>
-        <w:t>class TaskManagerApp extends StatelessWidget {</w:t>
-      </w:r>
-    </w:p>
-    <w:p>
-      <w:pPr>
-        <w:spacing w:line="190" w:lineRule="exact" w:after="0"/>
-        <w:jc w:val="left"/>
-      </w:pPr>
-      <w:r>
-        <w:rPr>
-          <w:rFonts w:ascii="Cascadia Mono" w:hAnsi="Cascadia Mono" w:cs="Cascadia Mono"/>
-          <w:b w:val="0"/>
-          <w:sz w:val="19"/>
-        </w:rPr>
-        <w:t xml:space="preserve">  const TaskManagerApp({super.key});</w:t>
-      </w:r>
-    </w:p>
-    <w:p>
-      <w:pPr>
-        <w:spacing w:line="190" w:lineRule="exact" w:after="0"/>
-        <w:jc w:val="left"/>
-      </w:pPr>
-      <w:r>
-        <w:rPr>
-          <w:rFonts w:ascii="Cascadia Mono" w:hAnsi="Cascadia Mono" w:cs="Cascadia Mono"/>
-          <w:b w:val="0"/>
-          <w:sz w:val="19"/>
-        </w:rPr>
-        <w:t xml:space="preserve">  @override</w:t>
-      </w:r>
-    </w:p>
-    <w:p>
-      <w:pPr>
-        <w:spacing w:line="190" w:lineRule="exact" w:after="0"/>
-        <w:jc w:val="left"/>
-      </w:pPr>
-      <w:r>
-        <w:rPr>
-          <w:rFonts w:ascii="Cascadia Mono" w:hAnsi="Cascadia Mono" w:cs="Cascadia Mono"/>
-          <w:b w:val="0"/>
-          <w:sz w:val="19"/>
-        </w:rPr>
-        <w:t xml:space="preserve">  Widget build(BuildContext context) {</w:t>
-      </w:r>
-    </w:p>
-    <w:p>
-      <w:pPr>
-        <w:spacing w:line="190" w:lineRule="exact" w:after="0"/>
-        <w:jc w:val="left"/>
-      </w:pPr>
-      <w:r>
-        <w:rPr>
-          <w:rFonts w:ascii="Cascadia Mono" w:hAnsi="Cascadia Mono" w:cs="Cascadia Mono"/>
-          <w:b w:val="0"/>
-          <w:sz w:val="19"/>
-        </w:rPr>
-        <w:t xml:space="preserve">    return MaterialApp(</w:t>
-      </w:r>
-    </w:p>
-    <w:p>
-      <w:pPr>
-        <w:spacing w:line="190" w:lineRule="exact" w:after="0"/>
-        <w:jc w:val="left"/>
-      </w:pPr>
-      <w:r>
-        <w:rPr>
-          <w:rFonts w:ascii="Cascadia Mono" w:hAnsi="Cascadia Mono" w:cs="Cascadia Mono"/>
-          <w:b w:val="0"/>
-          <w:sz w:val="19"/>
-        </w:rPr>
-        <w:t xml:space="preserve">      title: 'Менеджер завдань',</w:t>
-      </w:r>
-    </w:p>
-    <w:p>
-      <w:pPr>
-        <w:spacing w:line="190" w:lineRule="exact" w:after="0"/>
-        <w:jc w:val="left"/>
-      </w:pPr>
-      <w:r>
-        <w:rPr>
-          <w:rFonts w:ascii="Cascadia Mono" w:hAnsi="Cascadia Mono" w:cs="Cascadia Mono"/>
-          <w:b w:val="0"/>
-          <w:sz w:val="19"/>
-        </w:rPr>
-        <w:t xml:space="preserve">      debugShowCheckedModeBanner: false,</w:t>
-      </w:r>
-    </w:p>
-    <w:p>
-      <w:pPr>
-        <w:spacing w:line="190" w:lineRule="exact" w:after="0"/>
-        <w:jc w:val="left"/>
-      </w:pPr>
-      <w:r>
-        <w:rPr>
-          <w:rFonts w:ascii="Cascadia Mono" w:hAnsi="Cascadia Mono" w:cs="Cascadia Mono"/>
-          <w:b w:val="0"/>
-          <w:sz w:val="19"/>
-        </w:rPr>
-        <w:t xml:space="preserve">      theme: ThemeData(</w:t>
-      </w:r>
-    </w:p>
-    <w:p>
-      <w:pPr>
-        <w:spacing w:line="190" w:lineRule="exact" w:after="0"/>
-        <w:jc w:val="left"/>
-      </w:pPr>
-      <w:r>
-        <w:rPr>
-          <w:rFonts w:ascii="Cascadia Mono" w:hAnsi="Cascadia Mono" w:cs="Cascadia Mono"/>
-          <w:b w:val="0"/>
-          <w:sz w:val="19"/>
-        </w:rPr>
-        <w:t xml:space="preserve">        useMaterial3: true,</w:t>
-      </w:r>
-    </w:p>
-    <w:p>
-      <w:pPr>
-        <w:spacing w:line="190" w:lineRule="exact" w:after="0"/>
-        <w:jc w:val="left"/>
-      </w:pPr>
-      <w:r>
-        <w:rPr>
-          <w:rFonts w:ascii="Cascadia Mono" w:hAnsi="Cascadia Mono" w:cs="Cascadia Mono"/>
-          <w:b w:val="0"/>
-          <w:sz w:val="19"/>
-        </w:rPr>
-        <w:t xml:space="preserve">        colorScheme: ColorScheme.fromSeed(</w:t>
-      </w:r>
-    </w:p>
-    <w:p>
-      <w:pPr>
-        <w:spacing w:line="190" w:lineRule="exact" w:after="0"/>
-        <w:jc w:val="left"/>
-      </w:pPr>
-      <w:r>
-        <w:rPr>
-          <w:rFonts w:ascii="Cascadia Mono" w:hAnsi="Cascadia Mono" w:cs="Cascadia Mono"/>
-          <w:b w:val="0"/>
-          <w:sz w:val="19"/>
-        </w:rPr>
-        <w:t xml:space="preserve">          seedColor: const Color(0xFFD4FF00),</w:t>
-      </w:r>
-    </w:p>
-    <w:p>
-      <w:pPr>
-        <w:spacing w:line="190" w:lineRule="exact" w:after="0"/>
-        <w:jc w:val="left"/>
-      </w:pPr>
-      <w:r>
-        <w:rPr>
-          <w:rFonts w:ascii="Cascadia Mono" w:hAnsi="Cascadia Mono" w:cs="Cascadia Mono"/>
-          <w:b w:val="0"/>
-          <w:sz w:val="19"/>
-        </w:rPr>
-        <w:t xml:space="preserve">          brightness: Brightness.dark,</w:t>
-      </w:r>
-    </w:p>
-    <w:p>
-      <w:pPr>
-        <w:spacing w:line="190" w:lineRule="exact" w:after="0"/>
-        <w:jc w:val="left"/>
-      </w:pPr>
-      <w:r>
-        <w:rPr>
-          <w:rFonts w:ascii="Cascadia Mono" w:hAnsi="Cascadia Mono" w:cs="Cascadia Mono"/>
-          <w:b w:val="0"/>
-          <w:sz w:val="19"/>
-        </w:rPr>
-        <w:t xml:space="preserve">          primary: const Color(0xFFD4FF00),</w:t>
-      </w:r>
-    </w:p>
-    <w:p>
-      <w:pPr>
-        <w:spacing w:line="190" w:lineRule="exact" w:after="0"/>
-        <w:jc w:val="left"/>
-      </w:pPr>
-      <w:r>
-        <w:rPr>
-          <w:rFonts w:ascii="Cascadia Mono" w:hAnsi="Cascadia Mono" w:cs="Cascadia Mono"/>
-          <w:b w:val="0"/>
-          <w:sz w:val="19"/>
-        </w:rPr>
-        <w:t xml:space="preserve">          surface: const Color(0xFF15181F),</w:t>
-      </w:r>
-    </w:p>
-    <w:p>
-      <w:pPr>
-        <w:spacing w:line="190" w:lineRule="exact" w:after="0"/>
-        <w:jc w:val="left"/>
-      </w:pPr>
-      <w:r>
-        <w:rPr>
-          <w:rFonts w:ascii="Cascadia Mono" w:hAnsi="Cascadia Mono" w:cs="Cascadia Mono"/>
-          <w:b w:val="0"/>
-          <w:sz w:val="19"/>
-        </w:rPr>
-        <w:t xml:space="preserve">        ),</w:t>
-      </w:r>
-    </w:p>
-    <w:p>
-      <w:pPr>
-        <w:spacing w:line="190" w:lineRule="exact" w:after="0"/>
-        <w:jc w:val="left"/>
-      </w:pPr>
-      <w:r>
-        <w:rPr>
-          <w:rFonts w:ascii="Cascadia Mono" w:hAnsi="Cascadia Mono" w:cs="Cascadia Mono"/>
-          <w:b w:val="0"/>
-          <w:sz w:val="19"/>
-        </w:rPr>
-        <w:t xml:space="preserve">        scaffoldBackgroundColor: const Color(0xFF0D0F13),</w:t>
-      </w:r>
-    </w:p>
-    <w:p>
-      <w:pPr>
-        <w:spacing w:line="190" w:lineRule="exact" w:after="0"/>
-        <w:jc w:val="left"/>
-      </w:pPr>
-      <w:r>
-        <w:rPr>
-          <w:rFonts w:ascii="Cascadia Mono" w:hAnsi="Cascadia Mono" w:cs="Cascadia Mono"/>
-          <w:b w:val="0"/>
-          <w:sz w:val="19"/>
-        </w:rPr>
-        <w:t xml:space="preserve">      ),</w:t>
-      </w:r>
-    </w:p>
-    <w:p>
-      <w:pPr>
-        <w:spacing w:line="190" w:lineRule="exact" w:after="0"/>
-        <w:jc w:val="left"/>
-      </w:pPr>
-      <w:r>
-        <w:rPr>
-          <w:rFonts w:ascii="Cascadia Mono" w:hAnsi="Cascadia Mono" w:cs="Cascadia Mono"/>
-          <w:b w:val="0"/>
-          <w:sz w:val="19"/>
-        </w:rPr>
-        <w:t xml:space="preserve">      home: const TaskManagerHomePage(title: 'Менеджер завдань'),</w:t>
-      </w:r>
-    </w:p>
-    <w:p>
-      <w:pPr>
-        <w:spacing w:line="190" w:lineRule="exact" w:after="0"/>
-        <w:jc w:val="left"/>
-      </w:pPr>
-      <w:r>
-        <w:rPr>
-          <w:rFonts w:ascii="Cascadia Mono" w:hAnsi="Cascadia Mono" w:cs="Cascadia Mono"/>
-          <w:b w:val="0"/>
-          <w:sz w:val="19"/>
-        </w:rPr>
-        <w:t xml:space="preserve">    );</w:t>
-      </w:r>
-    </w:p>
-    <w:p>
-      <w:pPr>
-        <w:spacing w:line="190" w:lineRule="exact" w:after="0"/>
-        <w:jc w:val="left"/>
-      </w:pPr>
-      <w:r>
-        <w:rPr>
-          <w:rFonts w:ascii="Cascadia Mono" w:hAnsi="Cascadia Mono" w:cs="Cascadia Mono"/>
-          <w:b w:val="0"/>
-          <w:sz w:val="19"/>
-        </w:rPr>
-        <w:t xml:space="preserve">  }</w:t>
-      </w:r>
-    </w:p>
-    <w:p>
-      <w:pPr>
-        <w:spacing w:line="190" w:lineRule="exact" w:after="0"/>
-        <w:jc w:val="left"/>
-      </w:pPr>
-      <w:r>
-        <w:rPr>
-          <w:rFonts w:ascii="Cascadia Mono" w:hAnsi="Cascadia Mono" w:cs="Cascadia Mono"/>
-          <w:b w:val="0"/>
-          <w:sz w:val="19"/>
-        </w:rPr>
-        <w:t>}</w:t>
-      </w:r>
-    </w:p>
-    <w:p>
-      <w:pPr>
-        <w:spacing w:line="190" w:lineRule="exact" w:after="0"/>
-        <w:jc w:val="left"/>
-      </w:pPr>
-    </w:p>
-    <w:p>
-      <w:pPr>
-        <w:spacing w:line="190" w:lineRule="exact" w:after="0"/>
-        <w:jc w:val="left"/>
-      </w:pPr>
-      <w:r>
-        <w:rPr>
-          <w:rFonts w:ascii="Cascadia Mono" w:hAnsi="Cascadia Mono" w:cs="Cascadia Mono"/>
-          <w:b w:val="0"/>
-          <w:sz w:val="19"/>
-        </w:rPr>
-        <w:t>class TaskItem {</w:t>
-      </w:r>
-    </w:p>
-    <w:p>
-      <w:pPr>
-        <w:spacing w:line="190" w:lineRule="exact" w:after="0"/>
-        <w:jc w:val="left"/>
-      </w:pPr>
-      <w:r>
-        <w:rPr>
-          <w:rFonts w:ascii="Cascadia Mono" w:hAnsi="Cascadia Mono" w:cs="Cascadia Mono"/>
-          <w:b w:val="0"/>
-          <w:sz w:val="19"/>
-        </w:rPr>
-        <w:t xml:space="preserve">  final String title;</w:t>
-      </w:r>
-    </w:p>
-    <w:p>
-      <w:pPr>
-        <w:spacing w:line="190" w:lineRule="exact" w:after="0"/>
-        <w:jc w:val="left"/>
-      </w:pPr>
-      <w:r>
-        <w:rPr>
-          <w:rFonts w:ascii="Cascadia Mono" w:hAnsi="Cascadia Mono" w:cs="Cascadia Mono"/>
-          <w:b w:val="0"/>
-          <w:sz w:val="19"/>
-        </w:rPr>
-        <w:t xml:space="preserve">  final String category;</w:t>
-      </w:r>
-    </w:p>
-    <w:p>
-      <w:pPr>
-        <w:spacing w:line="190" w:lineRule="exact" w:after="0"/>
-        <w:jc w:val="left"/>
-      </w:pPr>
-      <w:r>
-        <w:rPr>
-          <w:rFonts w:ascii="Cascadia Mono" w:hAnsi="Cascadia Mono" w:cs="Cascadia Mono"/>
-          <w:b w:val="0"/>
-          <w:sz w:val="19"/>
-        </w:rPr>
-        <w:t xml:space="preserve">  bool isCompleted;</w:t>
-      </w:r>
-    </w:p>
-    <w:p>
-      <w:pPr>
-        <w:spacing w:line="190" w:lineRule="exact" w:after="0"/>
-        <w:jc w:val="left"/>
-      </w:pPr>
-      <w:r>
-        <w:rPr>
-          <w:rFonts w:ascii="Cascadia Mono" w:hAnsi="Cascadia Mono" w:cs="Cascadia Mono"/>
-          <w:b w:val="0"/>
-          <w:sz w:val="19"/>
-        </w:rPr>
-        <w:t xml:space="preserve">  TaskItem({required this.title, required this.category, this.isCompleted = false});</w:t>
-      </w:r>
-    </w:p>
-    <w:p>
-      <w:pPr>
-        <w:spacing w:line="190" w:lineRule="exact" w:after="0"/>
-        <w:jc w:val="left"/>
-      </w:pPr>
-      <w:r>
-        <w:rPr>
-          <w:rFonts w:ascii="Cascadia Mono" w:hAnsi="Cascadia Mono" w:cs="Cascadia Mono"/>
-          <w:b w:val="0"/>
-          <w:sz w:val="19"/>
-        </w:rPr>
-        <w:t>}</w:t>
-      </w:r>
-    </w:p>
-    <w:p>
-      <w:pPr>
-        <w:spacing w:line="190" w:lineRule="exact" w:after="0"/>
-        <w:jc w:val="left"/>
-      </w:pPr>
-    </w:p>
-    <w:p>
-      <w:pPr>
-        <w:spacing w:line="190" w:lineRule="exact" w:after="0"/>
-        <w:jc w:val="left"/>
-      </w:pPr>
-      <w:r>
-        <w:rPr>
-          <w:rFonts w:ascii="Cascadia Mono" w:hAnsi="Cascadia Mono" w:cs="Cascadia Mono"/>
-          <w:b w:val="0"/>
-          <w:sz w:val="19"/>
-        </w:rPr>
-        <w:t>class TaskManagerHomePage extends StatefulWidget {</w:t>
-      </w:r>
-    </w:p>
-    <w:p>
-      <w:pPr>
-        <w:spacing w:line="190" w:lineRule="exact" w:after="0"/>
-        <w:jc w:val="left"/>
-      </w:pPr>
-      <w:r>
-        <w:rPr>
-          <w:rFonts w:ascii="Cascadia Mono" w:hAnsi="Cascadia Mono" w:cs="Cascadia Mono"/>
-          <w:b w:val="0"/>
-          <w:sz w:val="19"/>
-        </w:rPr>
-        <w:t xml:space="preserve">  final String title;</w:t>
-      </w:r>
-    </w:p>
-    <w:p>
-      <w:pPr>
-        <w:spacing w:line="190" w:lineRule="exact" w:after="0"/>
-        <w:jc w:val="left"/>
-      </w:pPr>
-      <w:r>
-        <w:rPr>
-          <w:rFonts w:ascii="Cascadia Mono" w:hAnsi="Cascadia Mono" w:cs="Cascadia Mono"/>
-          <w:b w:val="0"/>
-          <w:sz w:val="19"/>
-        </w:rPr>
-        <w:t xml:space="preserve">  const TaskManagerHomePage({super.key, required this.title});</w:t>
-      </w:r>
-    </w:p>
-    <w:p>
-      <w:pPr>
-        <w:spacing w:line="190" w:lineRule="exact" w:after="0"/>
-        <w:jc w:val="left"/>
-      </w:pPr>
-      <w:r>
-        <w:rPr>
-          <w:rFonts w:ascii="Cascadia Mono" w:hAnsi="Cascadia Mono" w:cs="Cascadia Mono"/>
-          <w:b w:val="0"/>
-          <w:sz w:val="19"/>
-        </w:rPr>
-        <w:t xml:space="preserve">  @override</w:t>
-      </w:r>
-    </w:p>
-    <w:p>
-      <w:pPr>
-        <w:spacing w:line="190" w:lineRule="exact" w:after="0"/>
-        <w:jc w:val="left"/>
-      </w:pPr>
-      <w:r>
-        <w:rPr>
-          <w:rFonts w:ascii="Cascadia Mono" w:hAnsi="Cascadia Mono" w:cs="Cascadia Mono"/>
-          <w:b w:val="0"/>
-          <w:sz w:val="19"/>
-        </w:rPr>
-        <w:t xml:space="preserve">  State&lt;TaskManagerHomePage&gt; createState() =&gt; _TaskManagerHomePageState();</w:t>
-      </w:r>
-    </w:p>
-    <w:p>
-      <w:pPr>
-        <w:spacing w:line="190" w:lineRule="exact" w:after="0"/>
-        <w:jc w:val="left"/>
-      </w:pPr>
-      <w:r>
-        <w:rPr>
-          <w:rFonts w:ascii="Cascadia Mono" w:hAnsi="Cascadia Mono" w:cs="Cascadia Mono"/>
-          <w:b w:val="0"/>
-          <w:sz w:val="19"/>
-        </w:rPr>
-        <w:t>}</w:t>
-      </w:r>
-    </w:p>
-    <w:p>
-      <w:pPr>
-        <w:spacing w:line="190" w:lineRule="exact" w:after="0"/>
-        <w:jc w:val="left"/>
-      </w:pPr>
-    </w:p>
-    <w:p>
-      <w:pPr>
-        <w:spacing w:line="190" w:lineRule="exact" w:after="0"/>
-        <w:jc w:val="left"/>
-      </w:pPr>
-      <w:r>
-        <w:rPr>
-          <w:rFonts w:ascii="Cascadia Mono" w:hAnsi="Cascadia Mono" w:cs="Cascadia Mono"/>
-          <w:b w:val="0"/>
-          <w:sz w:val="19"/>
-        </w:rPr>
-        <w:t>class _TaskManagerHomePageState extends State&lt;TaskManagerHomePage&gt; {</w:t>
-      </w:r>
-    </w:p>
-    <w:p>
-      <w:pPr>
-        <w:spacing w:line="190" w:lineRule="exact" w:after="0"/>
-        <w:jc w:val="left"/>
-      </w:pPr>
-      <w:r>
-        <w:rPr>
-          <w:rFonts w:ascii="Cascadia Mono" w:hAnsi="Cascadia Mono" w:cs="Cascadia Mono"/>
-          <w:b w:val="0"/>
-          <w:sz w:val="19"/>
-        </w:rPr>
-        <w:t xml:space="preserve">  final List&lt;TaskItem&gt; _tasks = [</w:t>
-      </w:r>
-    </w:p>
-    <w:p>
-      <w:pPr>
-        <w:spacing w:line="190" w:lineRule="exact" w:after="0"/>
-        <w:jc w:val="left"/>
-      </w:pPr>
-      <w:r>
-        <w:rPr>
-          <w:rFonts w:ascii="Cascadia Mono" w:hAnsi="Cascadia Mono" w:cs="Cascadia Mono"/>
-          <w:b w:val="0"/>
-          <w:sz w:val="19"/>
-        </w:rPr>
-        <w:t xml:space="preserve">    TaskItem(title: 'Встановити Android Studio та Flutter SDK', category: 'Навчання', isCompleted: true),</w:t>
-      </w:r>
-    </w:p>
-    <w:p>
-      <w:pPr>
-        <w:spacing w:line="190" w:lineRule="exact" w:after="0"/>
-        <w:jc w:val="left"/>
-      </w:pPr>
-      <w:r>
-        <w:rPr>
-          <w:rFonts w:ascii="Cascadia Mono" w:hAnsi="Cascadia Mono" w:cs="Cascadia Mono"/>
-          <w:b w:val="0"/>
-          <w:sz w:val="19"/>
-        </w:rPr>
-        <w:t xml:space="preserve">    TaskItem(title: 'Налаштувати емулятор Android', category: 'Навчання', isCompleted: true),</w:t>
-      </w:r>
-    </w:p>
-    <w:p>
-      <w:pPr>
-        <w:spacing w:line="190" w:lineRule="exact" w:after="0"/>
-        <w:jc w:val="left"/>
-      </w:pPr>
-      <w:r>
-        <w:rPr>
-          <w:rFonts w:ascii="Cascadia Mono" w:hAnsi="Cascadia Mono" w:cs="Cascadia Mono"/>
-          <w:b w:val="0"/>
-          <w:sz w:val="19"/>
-        </w:rPr>
-        <w:t xml:space="preserve">    TaskItem(title: 'Створити Flutter-проєкт для Варіанту 1', category: 'ПМД Лаб 1', isCompleted: true),</w:t>
-      </w:r>
-    </w:p>
-    <w:p>
-      <w:pPr>
-        <w:spacing w:line="190" w:lineRule="exact" w:after="0"/>
-        <w:jc w:val="left"/>
-      </w:pPr>
-      <w:r>
-        <w:rPr>
-          <w:rFonts w:ascii="Cascadia Mono" w:hAnsi="Cascadia Mono" w:cs="Cascadia Mono"/>
-          <w:b w:val="0"/>
-          <w:sz w:val="19"/>
-        </w:rPr>
-        <w:t xml:space="preserve">    TaskItem(title: 'Оформити звіт з лабораторної роботи №1', category: 'ПМД Лаб 1', isCompleted: true),</w:t>
-      </w:r>
-    </w:p>
-    <w:p>
-      <w:pPr>
-        <w:spacing w:line="190" w:lineRule="exact" w:after="0"/>
-        <w:jc w:val="left"/>
-      </w:pPr>
-      <w:r>
-        <w:rPr>
-          <w:rFonts w:ascii="Cascadia Mono" w:hAnsi="Cascadia Mono" w:cs="Cascadia Mono"/>
-          <w:b w:val="0"/>
-          <w:sz w:val="19"/>
-        </w:rPr>
-        <w:t xml:space="preserve">    TaskItem(title: 'Підготувати відповіді на контрольні запитання', category: 'ПМД Лаб 1', isCompleted: false),</w:t>
-      </w:r>
-    </w:p>
-    <w:p>
-      <w:pPr>
-        <w:spacing w:line="190" w:lineRule="exact" w:after="0"/>
-        <w:jc w:val="left"/>
-      </w:pPr>
-      <w:r>
-        <w:rPr>
-          <w:rFonts w:ascii="Cascadia Mono" w:hAnsi="Cascadia Mono" w:cs="Cascadia Mono"/>
-          <w:b w:val="0"/>
-          <w:sz w:val="19"/>
-        </w:rPr>
-        <w:t xml:space="preserve">  ];</w:t>
-      </w:r>
-    </w:p>
-    <w:p>
-      <w:pPr>
-        <w:spacing w:line="190" w:lineRule="exact" w:after="0"/>
-        <w:jc w:val="left"/>
-      </w:pPr>
-      <w:r>
-        <w:rPr>
-          <w:rFonts w:ascii="Cascadia Mono" w:hAnsi="Cascadia Mono" w:cs="Cascadia Mono"/>
-          <w:b w:val="0"/>
-          <w:sz w:val="19"/>
-        </w:rPr>
-        <w:t xml:space="preserve">  final TextEditingController _taskController = TextEditingController();</w:t>
-      </w:r>
-    </w:p>
-    <w:p>
-      <w:pPr>
-        <w:spacing w:line="190" w:lineRule="exact" w:after="0"/>
-        <w:jc w:val="left"/>
-      </w:pPr>
-      <w:r>
-        <w:rPr>
-          <w:rFonts w:ascii="Cascadia Mono" w:hAnsi="Cascadia Mono" w:cs="Cascadia Mono"/>
-          <w:b w:val="0"/>
-          <w:sz w:val="19"/>
-        </w:rPr>
-        <w:t xml:space="preserve">  int get _completedCount =&gt; _tasks.where((t) =&gt; t.isCompleted).length;</w:t>
-      </w:r>
-    </w:p>
-    <w:p>
-      <w:pPr>
-        <w:spacing w:line="190" w:lineRule="exact" w:after="0"/>
-        <w:jc w:val="left"/>
-      </w:pPr>
-    </w:p>
-    <w:p>
-      <w:pPr>
-        <w:spacing w:line="190" w:lineRule="exact" w:after="0"/>
-        <w:jc w:val="left"/>
-      </w:pPr>
-      <w:r>
-        <w:rPr>
-          <w:rFonts w:ascii="Cascadia Mono" w:hAnsi="Cascadia Mono" w:cs="Cascadia Mono"/>
-          <w:b w:val="0"/>
-          <w:sz w:val="19"/>
-        </w:rPr>
-        <w:t xml:space="preserve">  void _toggleTask(int index) {</w:t>
-      </w:r>
-    </w:p>
-    <w:p>
-      <w:pPr>
-        <w:spacing w:line="190" w:lineRule="exact" w:after="0"/>
-        <w:jc w:val="left"/>
-      </w:pPr>
-      <w:r>
-        <w:rPr>
-          <w:rFonts w:ascii="Cascadia Mono" w:hAnsi="Cascadia Mono" w:cs="Cascadia Mono"/>
-          <w:b w:val="0"/>
-          <w:sz w:val="19"/>
-        </w:rPr>
-        <w:t xml:space="preserve">    setState(() { _tasks[index].isCompleted = !_tasks[index].isCompleted; });</w:t>
-      </w:r>
-    </w:p>
-    <w:p>
-      <w:pPr>
-        <w:spacing w:line="190" w:lineRule="exact" w:after="0"/>
-        <w:jc w:val="left"/>
-      </w:pPr>
-      <w:r>
-        <w:rPr>
-          <w:rFonts w:ascii="Cascadia Mono" w:hAnsi="Cascadia Mono" w:cs="Cascadia Mono"/>
-          <w:b w:val="0"/>
-          <w:sz w:val="19"/>
-        </w:rPr>
-        <w:t xml:space="preserve">  }</w:t>
-      </w:r>
-    </w:p>
-    <w:p>
-      <w:pPr>
-        <w:spacing w:line="190" w:lineRule="exact" w:after="0"/>
-        <w:jc w:val="left"/>
-      </w:pPr>
-    </w:p>
-    <w:p>
-      <w:pPr>
-        <w:spacing w:line="190" w:lineRule="exact" w:after="0"/>
-        <w:jc w:val="left"/>
-      </w:pPr>
-      <w:r>
-        <w:rPr>
-          <w:rFonts w:ascii="Cascadia Mono" w:hAnsi="Cascadia Mono" w:cs="Cascadia Mono"/>
-          <w:b w:val="0"/>
-          <w:sz w:val="19"/>
-        </w:rPr>
-        <w:t xml:space="preserve">  @override</w:t>
-      </w:r>
-    </w:p>
-    <w:p>
-      <w:pPr>
-        <w:spacing w:line="190" w:lineRule="exact" w:after="0"/>
-        <w:jc w:val="left"/>
-      </w:pPr>
-      <w:r>
-        <w:rPr>
-          <w:rFonts w:ascii="Cascadia Mono" w:hAnsi="Cascadia Mono" w:cs="Cascadia Mono"/>
-          <w:b w:val="0"/>
-          <w:sz w:val="19"/>
-        </w:rPr>
-        <w:t xml:space="preserve">  Widget build(BuildContext context) {</w:t>
-      </w:r>
-    </w:p>
-    <w:p>
-      <w:pPr>
-        <w:spacing w:line="190" w:lineRule="exact" w:after="0"/>
-        <w:jc w:val="left"/>
-      </w:pPr>
-      <w:r>
-        <w:rPr>
-          <w:rFonts w:ascii="Cascadia Mono" w:hAnsi="Cascadia Mono" w:cs="Cascadia Mono"/>
-          <w:b w:val="0"/>
-          <w:sz w:val="19"/>
-        </w:rPr>
-        <w:t xml:space="preserve">    return Scaffold(</w:t>
-      </w:r>
-    </w:p>
-    <w:p>
-      <w:pPr>
-        <w:spacing w:line="190" w:lineRule="exact" w:after="0"/>
-        <w:jc w:val="left"/>
-      </w:pPr>
-      <w:r>
-        <w:rPr>
-          <w:rFonts w:ascii="Cascadia Mono" w:hAnsi="Cascadia Mono" w:cs="Cascadia Mono"/>
-          <w:b w:val="0"/>
-          <w:sz w:val="19"/>
-        </w:rPr>
-        <w:t xml:space="preserve">      appBar: AppBar(title: Text(widget.title), centerTitle: true),</w:t>
-      </w:r>
-    </w:p>
-    <w:p>
-      <w:pPr>
-        <w:spacing w:line="190" w:lineRule="exact" w:after="0"/>
-        <w:jc w:val="left"/>
-      </w:pPr>
-      <w:r>
-        <w:rPr>
-          <w:rFonts w:ascii="Cascadia Mono" w:hAnsi="Cascadia Mono" w:cs="Cascadia Mono"/>
-          <w:b w:val="0"/>
-          <w:sz w:val="19"/>
-        </w:rPr>
-        <w:t xml:space="preserve">      body: Padding(</w:t>
-      </w:r>
-    </w:p>
-    <w:p>
-      <w:pPr>
-        <w:spacing w:line="190" w:lineRule="exact" w:after="0"/>
-        <w:jc w:val="left"/>
-      </w:pPr>
-      <w:r>
-        <w:rPr>
-          <w:rFonts w:ascii="Cascadia Mono" w:hAnsi="Cascadia Mono" w:cs="Cascadia Mono"/>
-          <w:b w:val="0"/>
-          <w:sz w:val="19"/>
-        </w:rPr>
-        <w:t xml:space="preserve">        padding: const EdgeInsets.all(16.0),</w:t>
-      </w:r>
-    </w:p>
-    <w:p>
-      <w:pPr>
-        <w:spacing w:line="190" w:lineRule="exact" w:after="0"/>
-        <w:jc w:val="left"/>
-      </w:pPr>
-      <w:r>
-        <w:rPr>
-          <w:rFonts w:ascii="Cascadia Mono" w:hAnsi="Cascadia Mono" w:cs="Cascadia Mono"/>
-          <w:b w:val="0"/>
-          <w:sz w:val="19"/>
-        </w:rPr>
-        <w:t xml:space="preserve">        child: Column(</w:t>
-      </w:r>
-    </w:p>
-    <w:p>
-      <w:pPr>
-        <w:spacing w:line="190" w:lineRule="exact" w:after="0"/>
-        <w:jc w:val="left"/>
-      </w:pPr>
-      <w:r>
-        <w:rPr>
-          <w:rFonts w:ascii="Cascadia Mono" w:hAnsi="Cascadia Mono" w:cs="Cascadia Mono"/>
-          <w:b w:val="0"/>
-          <w:sz w:val="19"/>
-        </w:rPr>
-        <w:t xml:space="preserve">          children: [</w:t>
-      </w:r>
-    </w:p>
-    <w:p>
-      <w:pPr>
-        <w:spacing w:line="190" w:lineRule="exact" w:after="0"/>
-        <w:jc w:val="left"/>
-      </w:pPr>
-      <w:r>
-        <w:rPr>
-          <w:rFonts w:ascii="Cascadia Mono" w:hAnsi="Cascadia Mono" w:cs="Cascadia Mono"/>
-          <w:b w:val="0"/>
-          <w:sz w:val="19"/>
-        </w:rPr>
-        <w:t xml:space="preserve">            Text('Варіант 1: Менеджер завдань ($_completedCount / ${_tasks.length})'),</w:t>
-      </w:r>
-    </w:p>
-    <w:p>
-      <w:pPr>
-        <w:spacing w:line="190" w:lineRule="exact" w:after="0"/>
-        <w:jc w:val="left"/>
-      </w:pPr>
-      <w:r>
-        <w:rPr>
-          <w:rFonts w:ascii="Cascadia Mono" w:hAnsi="Cascadia Mono" w:cs="Cascadia Mono"/>
-          <w:b w:val="0"/>
-          <w:sz w:val="19"/>
-        </w:rPr>
-        <w:t xml:space="preserve">            Expanded(</w:t>
-      </w:r>
-    </w:p>
-    <w:p>
-      <w:pPr>
-        <w:spacing w:line="190" w:lineRule="exact" w:after="0"/>
-        <w:jc w:val="left"/>
-      </w:pPr>
-      <w:r>
-        <w:rPr>
-          <w:rFonts w:ascii="Cascadia Mono" w:hAnsi="Cascadia Mono" w:cs="Cascadia Mono"/>
-          <w:b w:val="0"/>
-          <w:sz w:val="19"/>
-        </w:rPr>
-        <w:t xml:space="preserve">              child: ListView.builder(</w:t>
-      </w:r>
-    </w:p>
-    <w:p>
-      <w:pPr>
-        <w:spacing w:line="190" w:lineRule="exact" w:after="0"/>
-        <w:jc w:val="left"/>
-      </w:pPr>
-      <w:r>
-        <w:rPr>
-          <w:rFonts w:ascii="Cascadia Mono" w:hAnsi="Cascadia Mono" w:cs="Cascadia Mono"/>
-          <w:b w:val="0"/>
-          <w:sz w:val="19"/>
-        </w:rPr>
-        <w:t xml:space="preserve">                itemCount: _tasks.length,</w:t>
-      </w:r>
-    </w:p>
-    <w:p>
-      <w:pPr>
-        <w:spacing w:line="190" w:lineRule="exact" w:after="0"/>
-        <w:jc w:val="left"/>
-      </w:pPr>
-      <w:r>
-        <w:rPr>
-          <w:rFonts w:ascii="Cascadia Mono" w:hAnsi="Cascadia Mono" w:cs="Cascadia Mono"/>
-          <w:b w:val="0"/>
-          <w:sz w:val="19"/>
-        </w:rPr>
-        <w:t xml:space="preserve">                itemBuilder: (context, i) =&gt; Card(</w:t>
-      </w:r>
-    </w:p>
-    <w:p>
-      <w:pPr>
-        <w:spacing w:line="190" w:lineRule="exact" w:after="0"/>
-        <w:jc w:val="left"/>
-      </w:pPr>
-      <w:r>
-        <w:rPr>
-          <w:rFonts w:ascii="Cascadia Mono" w:hAnsi="Cascadia Mono" w:cs="Cascadia Mono"/>
-          <w:b w:val="0"/>
-          <w:sz w:val="19"/>
-        </w:rPr>
-        <w:t xml:space="preserve">                  child: ListTile(</w:t>
-      </w:r>
-    </w:p>
-    <w:p>
-      <w:pPr>
-        <w:spacing w:line="190" w:lineRule="exact" w:after="0"/>
-        <w:jc w:val="left"/>
-      </w:pPr>
-      <w:r>
-        <w:rPr>
-          <w:rFonts w:ascii="Cascadia Mono" w:hAnsi="Cascadia Mono" w:cs="Cascadia Mono"/>
-          <w:b w:val="0"/>
-          <w:sz w:val="19"/>
-        </w:rPr>
-        <w:t xml:space="preserve">                    leading: Checkbox(value: _tasks[i].isCompleted, onChanged: (_) =&gt; _toggleTask(i)),</w:t>
-      </w:r>
-    </w:p>
-    <w:p>
-      <w:pPr>
-        <w:spacing w:line="190" w:lineRule="exact" w:after="0"/>
-        <w:jc w:val="left"/>
-      </w:pPr>
-      <w:r>
-        <w:rPr>
-          <w:rFonts w:ascii="Cascadia Mono" w:hAnsi="Cascadia Mono" w:cs="Cascadia Mono"/>
-          <w:b w:val="0"/>
-          <w:sz w:val="19"/>
-        </w:rPr>
-        <w:t xml:space="preserve">                    title: Text(_tasks[i].title),</w:t>
-      </w:r>
-    </w:p>
-    <w:p>
-      <w:pPr>
-        <w:spacing w:line="190" w:lineRule="exact" w:after="0"/>
-        <w:jc w:val="left"/>
-      </w:pPr>
-      <w:r>
-        <w:rPr>
-          <w:rFonts w:ascii="Cascadia Mono" w:hAnsi="Cascadia Mono" w:cs="Cascadia Mono"/>
-          <w:b w:val="0"/>
-          <w:sz w:val="19"/>
-        </w:rPr>
-        <w:t xml:space="preserve">                    subtitle: Text(_tasks[i].category),</w:t>
-      </w:r>
-    </w:p>
-    <w:p>
-      <w:pPr>
-        <w:spacing w:line="190" w:lineRule="exact" w:after="0"/>
-        <w:jc w:val="left"/>
-      </w:pPr>
-      <w:r>
-        <w:rPr>
-          <w:rFonts w:ascii="Cascadia Mono" w:hAnsi="Cascadia Mono" w:cs="Cascadia Mono"/>
-          <w:b w:val="0"/>
-          <w:sz w:val="19"/>
-        </w:rPr>
-        <w:t xml:space="preserve">                  ),</w:t>
-      </w:r>
-    </w:p>
-    <w:p>
-      <w:pPr>
-        <w:spacing w:line="190" w:lineRule="exact" w:after="0"/>
-        <w:jc w:val="left"/>
-      </w:pPr>
-      <w:r>
-        <w:rPr>
-          <w:rFonts w:ascii="Cascadia Mono" w:hAnsi="Cascadia Mono" w:cs="Cascadia Mono"/>
-          <w:b w:val="0"/>
-          <w:sz w:val="19"/>
-        </w:rPr>
-        <w:t xml:space="preserve">                ),</w:t>
-      </w:r>
-    </w:p>
-    <w:p>
-      <w:pPr>
-        <w:spacing w:line="190" w:lineRule="exact" w:after="0"/>
-        <w:jc w:val="left"/>
-      </w:pPr>
-      <w:r>
-        <w:rPr>
-          <w:rFonts w:ascii="Cascadia Mono" w:hAnsi="Cascadia Mono" w:cs="Cascadia Mono"/>
-          <w:b w:val="0"/>
-          <w:sz w:val="19"/>
-        </w:rPr>
-        <w:t xml:space="preserve">              ),</w:t>
-      </w:r>
-    </w:p>
-    <w:p>
-      <w:pPr>
-        <w:spacing w:line="190" w:lineRule="exact" w:after="0"/>
-        <w:jc w:val="left"/>
-      </w:pPr>
-      <w:r>
-        <w:rPr>
-          <w:rFonts w:ascii="Cascadia Mono" w:hAnsi="Cascadia Mono" w:cs="Cascadia Mono"/>
-          <w:b w:val="0"/>
-          <w:sz w:val="19"/>
-        </w:rPr>
-        <w:t xml:space="preserve">            ),</w:t>
-      </w:r>
-    </w:p>
-    <w:p>
-      <w:pPr>
-        <w:spacing w:line="190" w:lineRule="exact" w:after="0"/>
-        <w:jc w:val="left"/>
-      </w:pPr>
-      <w:r>
-        <w:rPr>
-          <w:rFonts w:ascii="Cascadia Mono" w:hAnsi="Cascadia Mono" w:cs="Cascadia Mono"/>
-          <w:b w:val="0"/>
-          <w:sz w:val="19"/>
-        </w:rPr>
-        <w:t xml:space="preserve">          ],</w:t>
-      </w:r>
-    </w:p>
-    <w:p>
-      <w:pPr>
-        <w:spacing w:line="190" w:lineRule="exact" w:after="0"/>
-        <w:jc w:val="left"/>
-      </w:pPr>
-      <w:r>
-        <w:rPr>
-          <w:rFonts w:ascii="Cascadia Mono" w:hAnsi="Cascadia Mono" w:cs="Cascadia Mono"/>
-          <w:b w:val="0"/>
-          <w:sz w:val="19"/>
-        </w:rPr>
-        <w:t xml:space="preserve">        ),</w:t>
-      </w:r>
-    </w:p>
-    <w:p>
-      <w:pPr>
-        <w:spacing w:line="190" w:lineRule="exact" w:after="0"/>
-        <w:jc w:val="left"/>
-      </w:pPr>
-      <w:r>
-        <w:rPr>
-          <w:rFonts w:ascii="Cascadia Mono" w:hAnsi="Cascadia Mono" w:cs="Cascadia Mono"/>
-          <w:b w:val="0"/>
-          <w:sz w:val="19"/>
-        </w:rPr>
-        <w:t xml:space="preserve">      ),</w:t>
-      </w:r>
-    </w:p>
-    <w:p>
-      <w:pPr>
-        <w:spacing w:line="190" w:lineRule="exact" w:after="0"/>
-        <w:jc w:val="left"/>
-      </w:pPr>
-      <w:r>
-        <w:rPr>
-          <w:rFonts w:ascii="Cascadia Mono" w:hAnsi="Cascadia Mono" w:cs="Cascadia Mono"/>
-          <w:b w:val="0"/>
-          <w:sz w:val="19"/>
-        </w:rPr>
-        <w:t xml:space="preserve">    );</w:t>
-      </w:r>
-    </w:p>
-    <w:p>
-      <w:pPr>
-        <w:spacing w:line="190" w:lineRule="exact" w:after="0"/>
-        <w:jc w:val="left"/>
-      </w:pPr>
-      <w:r>
-        <w:rPr>
-          <w:rFonts w:ascii="Cascadia Mono" w:hAnsi="Cascadia Mono" w:cs="Cascadia Mono"/>
-          <w:b w:val="0"/>
-          <w:sz w:val="19"/>
-        </w:rPr>
-        <w:t xml:space="preserve">  }</w:t>
-      </w:r>
-    </w:p>
-    <w:p>
-      <w:pPr>
-        <w:spacing w:line="190" w:lineRule="exact" w:after="0"/>
-        <w:jc w:val="left"/>
-      </w:pPr>
-      <w:r>
-        <w:rPr>
-          <w:rFonts w:ascii="Cascadia Mono" w:hAnsi="Cascadia Mono" w:cs="Cascadia Mono"/>
-          <w:b w:val="0"/>
-          <w:sz w:val="19"/>
-        </w:rPr>
-        <w:t>}</w:t>
-      </w:r>
-    </w:p>
-    <w:p>
-      <w:pPr>
-        <w:spacing w:line="276" w:lineRule="auto" w:after="0"/>
-        <w:jc w:val="left"/>
-      </w:pPr>
-      <w:r>
-        <w:rPr>
-          <w:rFonts w:ascii="Times New Roman" w:hAnsi="Times New Roman" w:cs="Times New Roman"/>
-          <w:b/>
-          <w:sz w:val="28"/>
-        </w:rPr>
-        <w:t>2. Результат тестування та запуску застосунку на Android-емуляторі (Android 16 / API 36):</w:t>
-      </w:r>
-    </w:p>
-    <w:p>
-      <w:pPr>
         <w:spacing w:after="0"/>
         <w:jc w:val="center"/>
       </w:pPr>
@@ -1633,7 +1477,7 @@
         <w:drawing>
           <wp:inline xmlns:a="http://schemas.openxmlformats.org/drawingml/2006/main" xmlns:pic="http://schemas.openxmlformats.org/drawingml/2006/picture">
             <wp:extent cx="6480000" cy="7237403"/>
-            <wp:docPr id="4" name="Picture 4"/>
+            <wp:docPr id="2" name="Picture 2"/>
             <wp:cNvGraphicFramePr>
               <a:graphicFrameLocks noChangeAspect="1"/>
             </wp:cNvGraphicFramePr>
@@ -1645,7 +1489,7 @@
                     <pic:cNvPicPr/>
                   </pic:nvPicPr>
                   <pic:blipFill>
-                    <a:blip r:embed="rId12"/>
+                    <a:blip r:embed="rId10"/>
                     <a:stretch>
                       <a:fillRect/>
                     </a:stretch>
@@ -1666,64 +1510,16 @@
     </w:p>
     <w:p>
       <w:pPr>
-        <w:spacing w:after="0"/>
-        <w:jc w:val="center"/>
-      </w:pPr>
-      <w:r>
-        <w:drawing>
-          <wp:inline xmlns:a="http://schemas.openxmlformats.org/drawingml/2006/main" xmlns:pic="http://schemas.openxmlformats.org/drawingml/2006/picture">
-            <wp:extent cx="6480000" cy="7237403"/>
-            <wp:docPr id="5" name="Picture 5"/>
-            <wp:cNvGraphicFramePr>
-              <a:graphicFrameLocks noChangeAspect="1"/>
-            </wp:cNvGraphicFramePr>
-            <a:graphic>
-              <a:graphicData uri="http://schemas.openxmlformats.org/drawingml/2006/picture">
-                <pic:pic>
-                  <pic:nvPicPr>
-                    <pic:cNvPr id="0" name="emulator_duo_dialogs.png"/>
-                    <pic:cNvPicPr/>
-                  </pic:nvPicPr>
-                  <pic:blipFill>
-                    <a:blip r:embed="rId13"/>
-                    <a:stretch>
-                      <a:fillRect/>
-                    </a:stretch>
-                  </pic:blipFill>
-                  <pic:spPr>
-                    <a:xfrm>
-                      <a:off x="0" y="0"/>
-                      <a:ext cx="6480000" cy="7237403"/>
-                    </a:xfrm>
-                    <a:prstGeom prst="rect"/>
-                  </pic:spPr>
-                </pic:pic>
-              </a:graphicData>
-            </a:graphic>
-          </wp:inline>
-        </w:drawing>
-      </w:r>
-    </w:p>
-    <w:p>
-      <w:pPr>
         <w:spacing w:line="276" w:lineRule="auto" w:after="0"/>
         <w:jc w:val="both"/>
       </w:pPr>
-      <w:r>
-        <w:rPr>
-          <w:rFonts w:ascii="Times New Roman" w:hAnsi="Times New Roman" w:cs="Times New Roman"/>
-          <w:b/>
-          <w:sz w:val="28"/>
-        </w:rPr>
-        <w:t xml:space="preserve">Завдання 6: </w:t>
-      </w:r>
       <w:r>
         <w:rPr>
           <w:rFonts w:ascii="Times New Roman" w:hAnsi="Times New Roman" w:cs="Times New Roman"/>
           <w:b w:val="0"/>
           <w:sz w:val="28"/>
         </w:rPr>
-        <w:t>Відповіді на контрольні запитання.</w:t>
+        <w:t>1. Що таке Flutter та для чого він використовується? Flutter — це відкритий кросплатформний UI-фреймворк від компанії Google, призначений для створення компільованих застосунків для мобільних систем (Android, iOS), настільних ОС та Web на основі єдиної кодової бази мовою Dart.</w:t>
       </w:r>
     </w:p>
     <w:p>
@@ -1737,9 +1533,7 @@
           <w:b w:val="0"/>
           <w:sz w:val="28"/>
         </w:rPr>
-        <w:t>1. Що таке Flutter та для чого він використовується?</w:t>
-        <w:br/>
-        <w:t>Flutter — це відкритий кросплатформний UI-фреймворк від компанії Google, призначений для створення компільованих високопродуктивних застосунків для мобільних систем (Android, iOS), настільних ОС (Windows, macOS, Linux) та Web на основі єдиної спільної кодової бази мовою програмування Dart. Головною перевагою є використання власного рушія рендерингу (Impeller / Skia), що гарантує ідентичний вигляд інтерфейсу на всіх пристроях.</w:t>
+        <w:t>2. Яке призначення Flutter SDK? Flutter SDK містить компілятор мови Dart, набір базових віджетів Material Design та Cupertino, утиліти командного рядка (flutter CLI) та інструменти для налагодження й збірки проєкту.</w:t>
       </w:r>
     </w:p>
     <w:p>
@@ -1753,9 +1547,7 @@
           <w:b w:val="0"/>
           <w:sz w:val="28"/>
         </w:rPr>
-        <w:t>2. Яке призначення Flutter SDK?</w:t>
-        <w:br/>
-        <w:t>Flutter SDK містить у собі повний набір інструментів розробника: компілятор Dart (AOT для релізу та JIT для розробки), базову бібліотеку віджетів Material Design та Cupertino, утиліти командного рядка (flutter CLI), драйвери налагодження, менеджер пакетів та залежностей, а також засоби для зв'язку з нативними платформами.</w:t>
+        <w:t>3. Що таке віджет у Flutter? Віджет — це базовий будівельний блок інтерфейсу у Flutter. Вони поділяються на StatelessWidget (незмінні віджети без власного стану) та StatefulWidget (динамічні віджети зі станом, який оновлюється за допомогою виклику setState).</w:t>
       </w:r>
     </w:p>
     <w:p>
@@ -1769,9 +1561,7 @@
           <w:b w:val="0"/>
           <w:sz w:val="28"/>
         </w:rPr>
-        <w:t>3. Що таке віджет у Flutter?</w:t>
-        <w:br/>
-        <w:t>Віджет (Widget) — це фундаментальний будівельний блок користувацького інтерфейсу у Flutter. Усе, що відображається на екрані (кнопки, текст, відступи, кольори та навіть структура розміщення), є віджетом. Віджети поділяються на два базові класи: StatelessWidget (незмінні віджети без внутрішнього динамічного стану) та StatefulWidget (віджети, що змінюють свій вигляд під час життєвого циклу завдяки виклику setState).</w:t>
+        <w:t>4. Яку роль виконує Android Studio під час розробки Flutter-застосунків? Android Studio слугує інтегрованим середовищем розробки (IDE): надає зручний редактор коду з підсвічуванням та автодоповненням, засоби керування Android SDK, емулятори пристроїв (Device Manager) та підтримку швидкого перезавантаження (Hot Reload).</w:t>
       </w:r>
     </w:p>
     <w:p>
@@ -1785,9 +1575,7 @@
           <w:b w:val="0"/>
           <w:sz w:val="28"/>
         </w:rPr>
-        <w:t>4. Яку роль виконує Android Studio під час розробки Flutter-застосунків?</w:t>
-        <w:br/>
-        <w:t>Android Studio виступає повноцінним інтегрованим середовищем розробки (IDE). Воно надає інструменти підсвічування та автодоповнення коду, швидкого рефакторингу, управління емуляторами через Device Manager, встановлення та оновлення Android SDK, візуального профайлінгу продуктивності (Flutter Inspector, DevTools) та підтримку гарячого перезавантаження (Stateful Hot Reload).</w:t>
+        <w:t>5. Для чого використовується команда flutter doctor? Команда виконує повну діагностику системи: перевіряє версію Flutter SDK, наявність і ліцензії Android SDK, засоби збірки під платформи та виявляє підключені пристрої й емулятори.</w:t>
       </w:r>
     </w:p>
     <w:p>
@@ -1801,25 +1589,7 @@
           <w:b w:val="0"/>
           <w:sz w:val="28"/>
         </w:rPr>
-        <w:t>5. Для чого використовується команда flutter doctor?</w:t>
-        <w:br/>
-        <w:t>Команда flutter doctor виконує комплексну перевірку стану системи розробника. Вона інспектує наявність та версії Flutter SDK, наявність Android SDK та ліцензій, встановлені засоби розробки для десктопу, браузери, підключені фізичні або емульовані пристрої та мережеві ресурси, виводячи детальний звіт і підказки для усунення помилок.</w:t>
-      </w:r>
-    </w:p>
-    <w:p>
-      <w:pPr>
-        <w:spacing w:line="276" w:lineRule="auto" w:after="0"/>
-        <w:jc w:val="both"/>
-      </w:pPr>
-      <w:r>
-        <w:rPr>
-          <w:rFonts w:ascii="Times New Roman" w:hAnsi="Times New Roman" w:cs="Times New Roman"/>
-          <w:b w:val="0"/>
-          <w:sz w:val="28"/>
-        </w:rPr>
-        <w:t>6. Яка структура стандартного Flutter-проєкту?</w:t>
-        <w:br/>
-        <w:t>Стандартний Flutter-проєкт складається з таких обов'язкових вузлів: каталог lib/ з точкою входу main.dart (основний вихідний код застосунку); каталог test/ (автоматичні тести); каталоги нативних платформ android/, ios/, windows/, linux/, web/ (містять конфігураційні файли збірки Gradle/Xcode/CMake для відповідних цільових ОС); файл pubspec.yaml (конфігурація назви, версії, залежностей та медіа-асетів); та analysis_options.yaml (налаштування статичного аналізу коду).</w:t>
+        <w:t>6. Яка структура стандартного Flutter-проєкту? Каталог lib/ містить вихідний код мовою Dart (точка входу main.dart), каталоги android/ та ios/ — конфігурацію під нативні платформи, test/ — модульні та віджет-тести, а файл pubspec.yaml описує конфігурацію і залежності проєкту.</w:t>
       </w:r>
     </w:p>
     <w:p>
@@ -1841,7 +1611,7 @@
           <w:b w:val="0"/>
           <w:sz w:val="28"/>
         </w:rPr>
-        <w:t>На цій лабораторній роботі я опанував процес розгортання та налаштування середовища розробки на базі Android Studio та Flutter SDK, навчився діагностувати стан системи за допомогою інструменту flutter doctor. Я створив кросплатформний мобільний проєкт під Варіант 1 («Менеджер завдань»), детально проаналізував архітектурну структуру директорій та конфігураційних файлів застосунку, успішно реалізував інтерфейс користувача з відстеженням завдань, запустив та всебічно протестував його на емуляторі Android 16 (API 36).</w:t>
+        <w:t>На цій лабораторній роботі, я встановив Android Studio та Flutter SDK, створив перший проєкт за Варіантом 1 («Менеджер завдань»), налаштував емулятор і перевірив роботу застосунку.</w:t>
       </w:r>
     </w:p>
     <w:sectPr>

</xml_diff>

<commit_message>
reports L1-L10: trimmed code sections to essentials (~90% removed)
</commit_message>
<xml_diff>
--- a/Lab_1/ПМД_КН-2327Б_Багрій-Белз_ЛР-1.docx
+++ b/Lab_1/ПМД_КН-2327Б_Багрій-Белз_ЛР-1.docx
@@ -147,380 +147,6 @@
           <w:b w:val="0"/>
           <w:sz w:val="19"/>
         </w:rPr>
-        <w:t>import 'package:flutter/material.dart';</w:t>
-      </w:r>
-    </w:p>
-    <w:p>
-      <w:pPr>
-        <w:spacing w:line="190" w:lineRule="exact" w:after="0"/>
-        <w:jc w:val="left"/>
-      </w:pPr>
-    </w:p>
-    <w:p>
-      <w:pPr>
-        <w:spacing w:line="190" w:lineRule="exact" w:after="0"/>
-        <w:jc w:val="left"/>
-      </w:pPr>
-      <w:r>
-        <w:rPr>
-          <w:rFonts w:ascii="Cascadia Mono" w:hAnsi="Cascadia Mono" w:cs="Cascadia Mono"/>
-          <w:b w:val="0"/>
-          <w:sz w:val="19"/>
-        </w:rPr>
-        <w:t>void main() {</w:t>
-      </w:r>
-    </w:p>
-    <w:p>
-      <w:pPr>
-        <w:spacing w:line="190" w:lineRule="exact" w:after="0"/>
-        <w:jc w:val="left"/>
-      </w:pPr>
-      <w:r>
-        <w:rPr>
-          <w:rFonts w:ascii="Cascadia Mono" w:hAnsi="Cascadia Mono" w:cs="Cascadia Mono"/>
-          <w:b w:val="0"/>
-          <w:sz w:val="19"/>
-        </w:rPr>
-        <w:t xml:space="preserve">  runApp(const TaskManagerApp());</w:t>
-      </w:r>
-    </w:p>
-    <w:p>
-      <w:pPr>
-        <w:spacing w:line="190" w:lineRule="exact" w:after="0"/>
-        <w:jc w:val="left"/>
-      </w:pPr>
-      <w:r>
-        <w:rPr>
-          <w:rFonts w:ascii="Cascadia Mono" w:hAnsi="Cascadia Mono" w:cs="Cascadia Mono"/>
-          <w:b w:val="0"/>
-          <w:sz w:val="19"/>
-        </w:rPr>
-        <w:t>}</w:t>
-      </w:r>
-    </w:p>
-    <w:p>
-      <w:pPr>
-        <w:spacing w:line="190" w:lineRule="exact" w:after="0"/>
-        <w:jc w:val="left"/>
-      </w:pPr>
-    </w:p>
-    <w:p>
-      <w:pPr>
-        <w:spacing w:line="190" w:lineRule="exact" w:after="0"/>
-        <w:jc w:val="left"/>
-      </w:pPr>
-      <w:r>
-        <w:rPr>
-          <w:rFonts w:ascii="Cascadia Mono" w:hAnsi="Cascadia Mono" w:cs="Cascadia Mono"/>
-          <w:b w:val="0"/>
-          <w:sz w:val="19"/>
-        </w:rPr>
-        <w:t>class TaskManagerApp extends StatelessWidget {</w:t>
-      </w:r>
-    </w:p>
-    <w:p>
-      <w:pPr>
-        <w:spacing w:line="190" w:lineRule="exact" w:after="0"/>
-        <w:jc w:val="left"/>
-      </w:pPr>
-      <w:r>
-        <w:rPr>
-          <w:rFonts w:ascii="Cascadia Mono" w:hAnsi="Cascadia Mono" w:cs="Cascadia Mono"/>
-          <w:b w:val="0"/>
-          <w:sz w:val="19"/>
-        </w:rPr>
-        <w:t xml:space="preserve">  const TaskManagerApp({super.key});</w:t>
-      </w:r>
-    </w:p>
-    <w:p>
-      <w:pPr>
-        <w:spacing w:line="190" w:lineRule="exact" w:after="0"/>
-        <w:jc w:val="left"/>
-      </w:pPr>
-    </w:p>
-    <w:p>
-      <w:pPr>
-        <w:spacing w:line="190" w:lineRule="exact" w:after="0"/>
-        <w:jc w:val="left"/>
-      </w:pPr>
-      <w:r>
-        <w:rPr>
-          <w:rFonts w:ascii="Cascadia Mono" w:hAnsi="Cascadia Mono" w:cs="Cascadia Mono"/>
-          <w:b w:val="0"/>
-          <w:sz w:val="19"/>
-        </w:rPr>
-        <w:t xml:space="preserve">  @override</w:t>
-      </w:r>
-    </w:p>
-    <w:p>
-      <w:pPr>
-        <w:spacing w:line="190" w:lineRule="exact" w:after="0"/>
-        <w:jc w:val="left"/>
-      </w:pPr>
-      <w:r>
-        <w:rPr>
-          <w:rFonts w:ascii="Cascadia Mono" w:hAnsi="Cascadia Mono" w:cs="Cascadia Mono"/>
-          <w:b w:val="0"/>
-          <w:sz w:val="19"/>
-        </w:rPr>
-        <w:t xml:space="preserve">  Widget build(BuildContext context) {</w:t>
-      </w:r>
-    </w:p>
-    <w:p>
-      <w:pPr>
-        <w:spacing w:line="190" w:lineRule="exact" w:after="0"/>
-        <w:jc w:val="left"/>
-      </w:pPr>
-      <w:r>
-        <w:rPr>
-          <w:rFonts w:ascii="Cascadia Mono" w:hAnsi="Cascadia Mono" w:cs="Cascadia Mono"/>
-          <w:b w:val="0"/>
-          <w:sz w:val="19"/>
-        </w:rPr>
-        <w:t xml:space="preserve">    return MaterialApp(</w:t>
-      </w:r>
-    </w:p>
-    <w:p>
-      <w:pPr>
-        <w:spacing w:line="190" w:lineRule="exact" w:after="0"/>
-        <w:jc w:val="left"/>
-      </w:pPr>
-      <w:r>
-        <w:rPr>
-          <w:rFonts w:ascii="Cascadia Mono" w:hAnsi="Cascadia Mono" w:cs="Cascadia Mono"/>
-          <w:b w:val="0"/>
-          <w:sz w:val="19"/>
-        </w:rPr>
-        <w:t xml:space="preserve">      title: 'Менеджер завдань',</w:t>
-      </w:r>
-    </w:p>
-    <w:p>
-      <w:pPr>
-        <w:spacing w:line="190" w:lineRule="exact" w:after="0"/>
-        <w:jc w:val="left"/>
-      </w:pPr>
-      <w:r>
-        <w:rPr>
-          <w:rFonts w:ascii="Cascadia Mono" w:hAnsi="Cascadia Mono" w:cs="Cascadia Mono"/>
-          <w:b w:val="0"/>
-          <w:sz w:val="19"/>
-        </w:rPr>
-        <w:t xml:space="preserve">      debugShowCheckedModeBanner: false,</w:t>
-      </w:r>
-    </w:p>
-    <w:p>
-      <w:pPr>
-        <w:spacing w:line="190" w:lineRule="exact" w:after="0"/>
-        <w:jc w:val="left"/>
-      </w:pPr>
-      <w:r>
-        <w:rPr>
-          <w:rFonts w:ascii="Cascadia Mono" w:hAnsi="Cascadia Mono" w:cs="Cascadia Mono"/>
-          <w:b w:val="0"/>
-          <w:sz w:val="19"/>
-        </w:rPr>
-        <w:t xml:space="preserve">      theme: ThemeData(</w:t>
-      </w:r>
-    </w:p>
-    <w:p>
-      <w:pPr>
-        <w:spacing w:line="190" w:lineRule="exact" w:after="0"/>
-        <w:jc w:val="left"/>
-      </w:pPr>
-      <w:r>
-        <w:rPr>
-          <w:rFonts w:ascii="Cascadia Mono" w:hAnsi="Cascadia Mono" w:cs="Cascadia Mono"/>
-          <w:b w:val="0"/>
-          <w:sz w:val="19"/>
-        </w:rPr>
-        <w:t xml:space="preserve">        useMaterial3: true,</w:t>
-      </w:r>
-    </w:p>
-    <w:p>
-      <w:pPr>
-        <w:spacing w:line="190" w:lineRule="exact" w:after="0"/>
-        <w:jc w:val="left"/>
-      </w:pPr>
-      <w:r>
-        <w:rPr>
-          <w:rFonts w:ascii="Cascadia Mono" w:hAnsi="Cascadia Mono" w:cs="Cascadia Mono"/>
-          <w:b w:val="0"/>
-          <w:sz w:val="19"/>
-        </w:rPr>
-        <w:t xml:space="preserve">        colorScheme: ColorScheme.fromSeed(</w:t>
-      </w:r>
-    </w:p>
-    <w:p>
-      <w:pPr>
-        <w:spacing w:line="190" w:lineRule="exact" w:after="0"/>
-        <w:jc w:val="left"/>
-      </w:pPr>
-      <w:r>
-        <w:rPr>
-          <w:rFonts w:ascii="Cascadia Mono" w:hAnsi="Cascadia Mono" w:cs="Cascadia Mono"/>
-          <w:b w:val="0"/>
-          <w:sz w:val="19"/>
-        </w:rPr>
-        <w:t xml:space="preserve">          seedColor: const Color(0xFFD4FF00),</w:t>
-      </w:r>
-    </w:p>
-    <w:p>
-      <w:pPr>
-        <w:spacing w:line="190" w:lineRule="exact" w:after="0"/>
-        <w:jc w:val="left"/>
-      </w:pPr>
-      <w:r>
-        <w:rPr>
-          <w:rFonts w:ascii="Cascadia Mono" w:hAnsi="Cascadia Mono" w:cs="Cascadia Mono"/>
-          <w:b w:val="0"/>
-          <w:sz w:val="19"/>
-        </w:rPr>
-        <w:t xml:space="preserve">          brightness: Brightness.dark,</w:t>
-      </w:r>
-    </w:p>
-    <w:p>
-      <w:pPr>
-        <w:spacing w:line="190" w:lineRule="exact" w:after="0"/>
-        <w:jc w:val="left"/>
-      </w:pPr>
-      <w:r>
-        <w:rPr>
-          <w:rFonts w:ascii="Cascadia Mono" w:hAnsi="Cascadia Mono" w:cs="Cascadia Mono"/>
-          <w:b w:val="0"/>
-          <w:sz w:val="19"/>
-        </w:rPr>
-        <w:t xml:space="preserve">          primary: const Color(0xFFD4FF00),</w:t>
-      </w:r>
-    </w:p>
-    <w:p>
-      <w:pPr>
-        <w:spacing w:line="190" w:lineRule="exact" w:after="0"/>
-        <w:jc w:val="left"/>
-      </w:pPr>
-      <w:r>
-        <w:rPr>
-          <w:rFonts w:ascii="Cascadia Mono" w:hAnsi="Cascadia Mono" w:cs="Cascadia Mono"/>
-          <w:b w:val="0"/>
-          <w:sz w:val="19"/>
-        </w:rPr>
-        <w:t xml:space="preserve">          surface: const Color(0xFF15181F),</w:t>
-      </w:r>
-    </w:p>
-    <w:p>
-      <w:pPr>
-        <w:spacing w:line="190" w:lineRule="exact" w:after="0"/>
-        <w:jc w:val="left"/>
-      </w:pPr>
-      <w:r>
-        <w:rPr>
-          <w:rFonts w:ascii="Cascadia Mono" w:hAnsi="Cascadia Mono" w:cs="Cascadia Mono"/>
-          <w:b w:val="0"/>
-          <w:sz w:val="19"/>
-        </w:rPr>
-        <w:t xml:space="preserve">        ),</w:t>
-      </w:r>
-    </w:p>
-    <w:p>
-      <w:pPr>
-        <w:spacing w:line="190" w:lineRule="exact" w:after="0"/>
-        <w:jc w:val="left"/>
-      </w:pPr>
-      <w:r>
-        <w:rPr>
-          <w:rFonts w:ascii="Cascadia Mono" w:hAnsi="Cascadia Mono" w:cs="Cascadia Mono"/>
-          <w:b w:val="0"/>
-          <w:sz w:val="19"/>
-        </w:rPr>
-        <w:t xml:space="preserve">        scaffoldBackgroundColor: const Color(0xFF0D0F13),</w:t>
-      </w:r>
-    </w:p>
-    <w:p>
-      <w:pPr>
-        <w:spacing w:line="190" w:lineRule="exact" w:after="0"/>
-        <w:jc w:val="left"/>
-      </w:pPr>
-      <w:r>
-        <w:rPr>
-          <w:rFonts w:ascii="Cascadia Mono" w:hAnsi="Cascadia Mono" w:cs="Cascadia Mono"/>
-          <w:b w:val="0"/>
-          <w:sz w:val="19"/>
-        </w:rPr>
-        <w:t xml:space="preserve">      ),</w:t>
-      </w:r>
-    </w:p>
-    <w:p>
-      <w:pPr>
-        <w:spacing w:line="190" w:lineRule="exact" w:after="0"/>
-        <w:jc w:val="left"/>
-      </w:pPr>
-      <w:r>
-        <w:rPr>
-          <w:rFonts w:ascii="Cascadia Mono" w:hAnsi="Cascadia Mono" w:cs="Cascadia Mono"/>
-          <w:b w:val="0"/>
-          <w:sz w:val="19"/>
-        </w:rPr>
-        <w:t xml:space="preserve">      home: const TaskManagerHomePage(title: 'Менеджер завдань'),</w:t>
-      </w:r>
-    </w:p>
-    <w:p>
-      <w:pPr>
-        <w:spacing w:line="190" w:lineRule="exact" w:after="0"/>
-        <w:jc w:val="left"/>
-      </w:pPr>
-      <w:r>
-        <w:rPr>
-          <w:rFonts w:ascii="Cascadia Mono" w:hAnsi="Cascadia Mono" w:cs="Cascadia Mono"/>
-          <w:b w:val="0"/>
-          <w:sz w:val="19"/>
-        </w:rPr>
-        <w:t xml:space="preserve">    );</w:t>
-      </w:r>
-    </w:p>
-    <w:p>
-      <w:pPr>
-        <w:spacing w:line="190" w:lineRule="exact" w:after="0"/>
-        <w:jc w:val="left"/>
-      </w:pPr>
-      <w:r>
-        <w:rPr>
-          <w:rFonts w:ascii="Cascadia Mono" w:hAnsi="Cascadia Mono" w:cs="Cascadia Mono"/>
-          <w:b w:val="0"/>
-          <w:sz w:val="19"/>
-        </w:rPr>
-        <w:t xml:space="preserve">  }</w:t>
-      </w:r>
-    </w:p>
-    <w:p>
-      <w:pPr>
-        <w:spacing w:line="190" w:lineRule="exact" w:after="0"/>
-        <w:jc w:val="left"/>
-      </w:pPr>
-      <w:r>
-        <w:rPr>
-          <w:rFonts w:ascii="Cascadia Mono" w:hAnsi="Cascadia Mono" w:cs="Cascadia Mono"/>
-          <w:b w:val="0"/>
-          <w:sz w:val="19"/>
-        </w:rPr>
-        <w:t>}</w:t>
-      </w:r>
-    </w:p>
-    <w:p>
-      <w:pPr>
-        <w:spacing w:line="190" w:lineRule="exact" w:after="0"/>
-        <w:jc w:val="left"/>
-      </w:pPr>
-    </w:p>
-    <w:p>
-      <w:pPr>
-        <w:spacing w:line="190" w:lineRule="exact" w:after="0"/>
-        <w:jc w:val="left"/>
-      </w:pPr>
-      <w:r>
-        <w:rPr>
-          <w:rFonts w:ascii="Cascadia Mono" w:hAnsi="Cascadia Mono" w:cs="Cascadia Mono"/>
-          <w:b w:val="0"/>
-          <w:sz w:val="19"/>
-        </w:rPr>
         <w:t>class TaskItem {</w:t>
       </w:r>
     </w:p>
@@ -611,102 +237,6 @@
           <w:b w:val="0"/>
           <w:sz w:val="19"/>
         </w:rPr>
-        <w:t>class TaskManagerHomePage extends StatefulWidget {</w:t>
-      </w:r>
-    </w:p>
-    <w:p>
-      <w:pPr>
-        <w:spacing w:line="190" w:lineRule="exact" w:after="0"/>
-        <w:jc w:val="left"/>
-      </w:pPr>
-      <w:r>
-        <w:rPr>
-          <w:rFonts w:ascii="Cascadia Mono" w:hAnsi="Cascadia Mono" w:cs="Cascadia Mono"/>
-          <w:b w:val="0"/>
-          <w:sz w:val="19"/>
-        </w:rPr>
-        <w:t xml:space="preserve">  final String title;</w:t>
-      </w:r>
-    </w:p>
-    <w:p>
-      <w:pPr>
-        <w:spacing w:line="190" w:lineRule="exact" w:after="0"/>
-        <w:jc w:val="left"/>
-      </w:pPr>
-      <w:r>
-        <w:rPr>
-          <w:rFonts w:ascii="Cascadia Mono" w:hAnsi="Cascadia Mono" w:cs="Cascadia Mono"/>
-          <w:b w:val="0"/>
-          <w:sz w:val="19"/>
-        </w:rPr>
-        <w:t xml:space="preserve">  const TaskManagerHomePage({super.key, required this.title});</w:t>
-      </w:r>
-    </w:p>
-    <w:p>
-      <w:pPr>
-        <w:spacing w:line="190" w:lineRule="exact" w:after="0"/>
-        <w:jc w:val="left"/>
-      </w:pPr>
-    </w:p>
-    <w:p>
-      <w:pPr>
-        <w:spacing w:line="190" w:lineRule="exact" w:after="0"/>
-        <w:jc w:val="left"/>
-      </w:pPr>
-      <w:r>
-        <w:rPr>
-          <w:rFonts w:ascii="Cascadia Mono" w:hAnsi="Cascadia Mono" w:cs="Cascadia Mono"/>
-          <w:b w:val="0"/>
-          <w:sz w:val="19"/>
-        </w:rPr>
-        <w:t xml:space="preserve">  @override</w:t>
-      </w:r>
-    </w:p>
-    <w:p>
-      <w:pPr>
-        <w:spacing w:line="190" w:lineRule="exact" w:after="0"/>
-        <w:jc w:val="left"/>
-      </w:pPr>
-      <w:r>
-        <w:rPr>
-          <w:rFonts w:ascii="Cascadia Mono" w:hAnsi="Cascadia Mono" w:cs="Cascadia Mono"/>
-          <w:b w:val="0"/>
-          <w:sz w:val="19"/>
-        </w:rPr>
-        <w:t xml:space="preserve">  State&lt;TaskManagerHomePage&gt; createState() =&gt; _TaskManagerHomePageState();</w:t>
-      </w:r>
-    </w:p>
-    <w:p>
-      <w:pPr>
-        <w:spacing w:line="190" w:lineRule="exact" w:after="0"/>
-        <w:jc w:val="left"/>
-      </w:pPr>
-      <w:r>
-        <w:rPr>
-          <w:rFonts w:ascii="Cascadia Mono" w:hAnsi="Cascadia Mono" w:cs="Cascadia Mono"/>
-          <w:b w:val="0"/>
-          <w:sz w:val="19"/>
-        </w:rPr>
-        <w:t>}</w:t>
-      </w:r>
-    </w:p>
-    <w:p>
-      <w:pPr>
-        <w:spacing w:line="190" w:lineRule="exact" w:after="0"/>
-        <w:jc w:val="left"/>
-      </w:pPr>
-    </w:p>
-    <w:p>
-      <w:pPr>
-        <w:spacing w:line="190" w:lineRule="exact" w:after="0"/>
-        <w:jc w:val="left"/>
-      </w:pPr>
-      <w:r>
-        <w:rPr>
-          <w:rFonts w:ascii="Cascadia Mono" w:hAnsi="Cascadia Mono" w:cs="Cascadia Mono"/>
-          <w:b w:val="0"/>
-          <w:sz w:val="19"/>
-        </w:rPr>
         <w:t>class _TaskManagerHomePageState extends State&lt;TaskManagerHomePage&gt; {</w:t>
       </w:r>
     </w:p>
@@ -735,63 +265,7 @@
           <w:b w:val="0"/>
           <w:sz w:val="19"/>
         </w:rPr>
-        <w:t xml:space="preserve">    TaskItem(title: 'Встановити Android Studio та Flutter SDK', category: 'Навчання', isCompleted: true),</w:t>
-      </w:r>
-    </w:p>
-    <w:p>
-      <w:pPr>
-        <w:spacing w:line="190" w:lineRule="exact" w:after="0"/>
-        <w:jc w:val="left"/>
-      </w:pPr>
-      <w:r>
-        <w:rPr>
-          <w:rFonts w:ascii="Cascadia Mono" w:hAnsi="Cascadia Mono" w:cs="Cascadia Mono"/>
-          <w:b w:val="0"/>
-          <w:sz w:val="19"/>
-        </w:rPr>
-        <w:t xml:space="preserve">    TaskItem(title: 'Налаштувати емулятор Android', category: 'Навчання', isCompleted: true),</w:t>
-      </w:r>
-    </w:p>
-    <w:p>
-      <w:pPr>
-        <w:spacing w:line="190" w:lineRule="exact" w:after="0"/>
-        <w:jc w:val="left"/>
-      </w:pPr>
-      <w:r>
-        <w:rPr>
-          <w:rFonts w:ascii="Cascadia Mono" w:hAnsi="Cascadia Mono" w:cs="Cascadia Mono"/>
-          <w:b w:val="0"/>
-          <w:sz w:val="19"/>
-        </w:rPr>
-        <w:t xml:space="preserve">    TaskItem(title: 'Створити Flutter-проєкт для Варіанту 1', category: 'ПМД Лаб 1', isCompleted: true),</w:t>
-      </w:r>
-    </w:p>
-    <w:p>
-      <w:pPr>
-        <w:spacing w:line="190" w:lineRule="exact" w:after="0"/>
-        <w:jc w:val="left"/>
-      </w:pPr>
-      <w:r>
-        <w:rPr>
-          <w:rFonts w:ascii="Cascadia Mono" w:hAnsi="Cascadia Mono" w:cs="Cascadia Mono"/>
-          <w:b w:val="0"/>
-          <w:sz w:val="19"/>
-        </w:rPr>
-        <w:t xml:space="preserve">    TaskItem(title: 'Оформити звіт з лабораторної роботи №1', category: 'ПМД Лаб 1', isCompleted: true),</w:t>
-      </w:r>
-    </w:p>
-    <w:p>
-      <w:pPr>
-        <w:spacing w:line="190" w:lineRule="exact" w:after="0"/>
-        <w:jc w:val="left"/>
-      </w:pPr>
-      <w:r>
-        <w:rPr>
-          <w:rFonts w:ascii="Cascadia Mono" w:hAnsi="Cascadia Mono" w:cs="Cascadia Mono"/>
-          <w:b w:val="0"/>
-          <w:sz w:val="19"/>
-        </w:rPr>
-        <w:t xml:space="preserve">    TaskItem(title: 'Підготувати відповіді на контрольні запитання', category: 'ПМД Лаб 1', isCompleted: false),</w:t>
+        <w:t xml:space="preserve">    // ... (пропуск неістотних рядків)</w:t>
       </w:r>
     </w:p>
     <w:p>
@@ -806,26 +280,6 @@
           <w:sz w:val="19"/>
         </w:rPr>
         <w:t xml:space="preserve">  ];</w:t>
-      </w:r>
-    </w:p>
-    <w:p>
-      <w:pPr>
-        <w:spacing w:line="190" w:lineRule="exact" w:after="0"/>
-        <w:jc w:val="left"/>
-      </w:pPr>
-    </w:p>
-    <w:p>
-      <w:pPr>
-        <w:spacing w:line="190" w:lineRule="exact" w:after="0"/>
-        <w:jc w:val="left"/>
-      </w:pPr>
-      <w:r>
-        <w:rPr>
-          <w:rFonts w:ascii="Cascadia Mono" w:hAnsi="Cascadia Mono" w:cs="Cascadia Mono"/>
-          <w:b w:val="0"/>
-          <w:sz w:val="19"/>
-        </w:rPr>
-        <w:t xml:space="preserve">  int get _completedCount =&gt; _tasks.where((t) =&gt; t.isCompleted).length;</w:t>
       </w:r>
     </w:p>
     <w:p>
@@ -909,19 +363,13 @@
         <w:spacing w:line="190" w:lineRule="exact" w:after="0"/>
         <w:jc w:val="left"/>
       </w:pPr>
-    </w:p>
-    <w:p>
-      <w:pPr>
-        <w:spacing w:line="190" w:lineRule="exact" w:after="0"/>
-        <w:jc w:val="left"/>
-      </w:pPr>
       <w:r>
         <w:rPr>
           <w:rFonts w:ascii="Cascadia Mono" w:hAnsi="Cascadia Mono" w:cs="Cascadia Mono"/>
           <w:b w:val="0"/>
           <w:sz w:val="19"/>
         </w:rPr>
-        <w:t xml:space="preserve">  @override</w:t>
+        <w:t xml:space="preserve">  // ... (пропуск неістотних рядків)</w:t>
       </w:r>
     </w:p>
     <w:p>
@@ -935,7 +383,7 @@
           <w:b w:val="0"/>
           <w:sz w:val="19"/>
         </w:rPr>
-        <w:t xml:space="preserve">  Widget build(BuildContext context) {</w:t>
+        <w:t xml:space="preserve">  // build: Scaffold &gt; ListView.builder &gt; Card &gt; ListTile(leading: Checkbox)</w:t>
       </w:r>
     </w:p>
     <w:p>
@@ -949,455 +397,7 @@
           <w:b w:val="0"/>
           <w:sz w:val="19"/>
         </w:rPr>
-        <w:t xml:space="preserve">    return Scaffold(</w:t>
-      </w:r>
-    </w:p>
-    <w:p>
-      <w:pPr>
-        <w:spacing w:line="190" w:lineRule="exact" w:after="0"/>
-        <w:jc w:val="left"/>
-      </w:pPr>
-      <w:r>
-        <w:rPr>
-          <w:rFonts w:ascii="Cascadia Mono" w:hAnsi="Cascadia Mono" w:cs="Cascadia Mono"/>
-          <w:b w:val="0"/>
-          <w:sz w:val="19"/>
-        </w:rPr>
-        <w:t xml:space="preserve">      appBar: AppBar(title: Text(widget.title), centerTitle: true),</w:t>
-      </w:r>
-    </w:p>
-    <w:p>
-      <w:pPr>
-        <w:spacing w:line="190" w:lineRule="exact" w:after="0"/>
-        <w:jc w:val="left"/>
-      </w:pPr>
-      <w:r>
-        <w:rPr>
-          <w:rFonts w:ascii="Cascadia Mono" w:hAnsi="Cascadia Mono" w:cs="Cascadia Mono"/>
-          <w:b w:val="0"/>
-          <w:sz w:val="19"/>
-        </w:rPr>
-        <w:t xml:space="preserve">      body: Padding(</w:t>
-      </w:r>
-    </w:p>
-    <w:p>
-      <w:pPr>
-        <w:spacing w:line="190" w:lineRule="exact" w:after="0"/>
-        <w:jc w:val="left"/>
-      </w:pPr>
-      <w:r>
-        <w:rPr>
-          <w:rFonts w:ascii="Cascadia Mono" w:hAnsi="Cascadia Mono" w:cs="Cascadia Mono"/>
-          <w:b w:val="0"/>
-          <w:sz w:val="19"/>
-        </w:rPr>
-        <w:t xml:space="preserve">        padding: const EdgeInsets.all(16.0),</w:t>
-      </w:r>
-    </w:p>
-    <w:p>
-      <w:pPr>
-        <w:spacing w:line="190" w:lineRule="exact" w:after="0"/>
-        <w:jc w:val="left"/>
-      </w:pPr>
-      <w:r>
-        <w:rPr>
-          <w:rFonts w:ascii="Cascadia Mono" w:hAnsi="Cascadia Mono" w:cs="Cascadia Mono"/>
-          <w:b w:val="0"/>
-          <w:sz w:val="19"/>
-        </w:rPr>
-        <w:t xml:space="preserve">        child: Column(</w:t>
-      </w:r>
-    </w:p>
-    <w:p>
-      <w:pPr>
-        <w:spacing w:line="190" w:lineRule="exact" w:after="0"/>
-        <w:jc w:val="left"/>
-      </w:pPr>
-      <w:r>
-        <w:rPr>
-          <w:rFonts w:ascii="Cascadia Mono" w:hAnsi="Cascadia Mono" w:cs="Cascadia Mono"/>
-          <w:b w:val="0"/>
-          <w:sz w:val="19"/>
-        </w:rPr>
-        <w:t xml:space="preserve">          children: [</w:t>
-      </w:r>
-    </w:p>
-    <w:p>
-      <w:pPr>
-        <w:spacing w:line="190" w:lineRule="exact" w:after="0"/>
-        <w:jc w:val="left"/>
-      </w:pPr>
-      <w:r>
-        <w:rPr>
-          <w:rFonts w:ascii="Cascadia Mono" w:hAnsi="Cascadia Mono" w:cs="Cascadia Mono"/>
-          <w:b w:val="0"/>
-          <w:sz w:val="19"/>
-        </w:rPr>
-        <w:t xml:space="preserve">            Text('Варіант 1: Менеджер завдань ($_completedCount / ${_tasks.length})'),</w:t>
-      </w:r>
-    </w:p>
-    <w:p>
-      <w:pPr>
-        <w:spacing w:line="190" w:lineRule="exact" w:after="0"/>
-        <w:jc w:val="left"/>
-      </w:pPr>
-      <w:r>
-        <w:rPr>
-          <w:rFonts w:ascii="Cascadia Mono" w:hAnsi="Cascadia Mono" w:cs="Cascadia Mono"/>
-          <w:b w:val="0"/>
-          <w:sz w:val="19"/>
-        </w:rPr>
-        <w:t xml:space="preserve">            const SizedBox(height: 10),</w:t>
-      </w:r>
-    </w:p>
-    <w:p>
-      <w:pPr>
-        <w:spacing w:line="190" w:lineRule="exact" w:after="0"/>
-        <w:jc w:val="left"/>
-      </w:pPr>
-      <w:r>
-        <w:rPr>
-          <w:rFonts w:ascii="Cascadia Mono" w:hAnsi="Cascadia Mono" w:cs="Cascadia Mono"/>
-          <w:b w:val="0"/>
-          <w:sz w:val="19"/>
-        </w:rPr>
-        <w:t xml:space="preserve">            Expanded(</w:t>
-      </w:r>
-    </w:p>
-    <w:p>
-      <w:pPr>
-        <w:spacing w:line="190" w:lineRule="exact" w:after="0"/>
-        <w:jc w:val="left"/>
-      </w:pPr>
-      <w:r>
-        <w:rPr>
-          <w:rFonts w:ascii="Cascadia Mono" w:hAnsi="Cascadia Mono" w:cs="Cascadia Mono"/>
-          <w:b w:val="0"/>
-          <w:sz w:val="19"/>
-        </w:rPr>
-        <w:t xml:space="preserve">              child: ListView.builder(</w:t>
-      </w:r>
-    </w:p>
-    <w:p>
-      <w:pPr>
-        <w:spacing w:line="190" w:lineRule="exact" w:after="0"/>
-        <w:jc w:val="left"/>
-      </w:pPr>
-      <w:r>
-        <w:rPr>
-          <w:rFonts w:ascii="Cascadia Mono" w:hAnsi="Cascadia Mono" w:cs="Cascadia Mono"/>
-          <w:b w:val="0"/>
-          <w:sz w:val="19"/>
-        </w:rPr>
-        <w:t xml:space="preserve">                itemCount: _tasks.length,</w:t>
-      </w:r>
-    </w:p>
-    <w:p>
-      <w:pPr>
-        <w:spacing w:line="190" w:lineRule="exact" w:after="0"/>
-        <w:jc w:val="left"/>
-      </w:pPr>
-      <w:r>
-        <w:rPr>
-          <w:rFonts w:ascii="Cascadia Mono" w:hAnsi="Cascadia Mono" w:cs="Cascadia Mono"/>
-          <w:b w:val="0"/>
-          <w:sz w:val="19"/>
-        </w:rPr>
-        <w:t xml:space="preserve">                itemBuilder: (context, i) =&gt; Card(</w:t>
-      </w:r>
-    </w:p>
-    <w:p>
-      <w:pPr>
-        <w:spacing w:line="190" w:lineRule="exact" w:after="0"/>
-        <w:jc w:val="left"/>
-      </w:pPr>
-      <w:r>
-        <w:rPr>
-          <w:rFonts w:ascii="Cascadia Mono" w:hAnsi="Cascadia Mono" w:cs="Cascadia Mono"/>
-          <w:b w:val="0"/>
-          <w:sz w:val="19"/>
-        </w:rPr>
-        <w:t xml:space="preserve">                  child: ListTile(</w:t>
-      </w:r>
-    </w:p>
-    <w:p>
-      <w:pPr>
-        <w:spacing w:line="190" w:lineRule="exact" w:after="0"/>
-        <w:jc w:val="left"/>
-      </w:pPr>
-      <w:r>
-        <w:rPr>
-          <w:rFonts w:ascii="Cascadia Mono" w:hAnsi="Cascadia Mono" w:cs="Cascadia Mono"/>
-          <w:b w:val="0"/>
-          <w:sz w:val="19"/>
-        </w:rPr>
-        <w:t xml:space="preserve">                    leading: Checkbox(value: _tasks[i].isCompleted, onChanged: (_) =&gt; _toggleTask(i)),</w:t>
-      </w:r>
-    </w:p>
-    <w:p>
-      <w:pPr>
-        <w:spacing w:line="190" w:lineRule="exact" w:after="0"/>
-        <w:jc w:val="left"/>
-      </w:pPr>
-      <w:r>
-        <w:rPr>
-          <w:rFonts w:ascii="Cascadia Mono" w:hAnsi="Cascadia Mono" w:cs="Cascadia Mono"/>
-          <w:b w:val="0"/>
-          <w:sz w:val="19"/>
-        </w:rPr>
-        <w:t xml:space="preserve">                    title: Text(_tasks[i].title),</w:t>
-      </w:r>
-    </w:p>
-    <w:p>
-      <w:pPr>
-        <w:spacing w:line="190" w:lineRule="exact" w:after="0"/>
-        <w:jc w:val="left"/>
-      </w:pPr>
-      <w:r>
-        <w:rPr>
-          <w:rFonts w:ascii="Cascadia Mono" w:hAnsi="Cascadia Mono" w:cs="Cascadia Mono"/>
-          <w:b w:val="0"/>
-          <w:sz w:val="19"/>
-        </w:rPr>
-        <w:t xml:space="preserve">                    subtitle: Text(_tasks[i].category),</w:t>
-      </w:r>
-    </w:p>
-    <w:p>
-      <w:pPr>
-        <w:spacing w:line="190" w:lineRule="exact" w:after="0"/>
-        <w:jc w:val="left"/>
-      </w:pPr>
-      <w:r>
-        <w:rPr>
-          <w:rFonts w:ascii="Cascadia Mono" w:hAnsi="Cascadia Mono" w:cs="Cascadia Mono"/>
-          <w:b w:val="0"/>
-          <w:sz w:val="19"/>
-        </w:rPr>
-        <w:t xml:space="preserve">                  ),</w:t>
-      </w:r>
-    </w:p>
-    <w:p>
-      <w:pPr>
-        <w:spacing w:line="190" w:lineRule="exact" w:after="0"/>
-        <w:jc w:val="left"/>
-      </w:pPr>
-      <w:r>
-        <w:rPr>
-          <w:rFonts w:ascii="Cascadia Mono" w:hAnsi="Cascadia Mono" w:cs="Cascadia Mono"/>
-          <w:b w:val="0"/>
-          <w:sz w:val="19"/>
-        </w:rPr>
-        <w:t xml:space="preserve">                ),</w:t>
-      </w:r>
-    </w:p>
-    <w:p>
-      <w:pPr>
-        <w:spacing w:line="190" w:lineRule="exact" w:after="0"/>
-        <w:jc w:val="left"/>
-      </w:pPr>
-      <w:r>
-        <w:rPr>
-          <w:rFonts w:ascii="Cascadia Mono" w:hAnsi="Cascadia Mono" w:cs="Cascadia Mono"/>
-          <w:b w:val="0"/>
-          <w:sz w:val="19"/>
-        </w:rPr>
-        <w:t xml:space="preserve">              ),</w:t>
-      </w:r>
-    </w:p>
-    <w:p>
-      <w:pPr>
-        <w:spacing w:line="190" w:lineRule="exact" w:after="0"/>
-        <w:jc w:val="left"/>
-      </w:pPr>
-      <w:r>
-        <w:rPr>
-          <w:rFonts w:ascii="Cascadia Mono" w:hAnsi="Cascadia Mono" w:cs="Cascadia Mono"/>
-          <w:b w:val="0"/>
-          <w:sz w:val="19"/>
-        </w:rPr>
-        <w:t xml:space="preserve">            ),</w:t>
-      </w:r>
-    </w:p>
-    <w:p>
-      <w:pPr>
-        <w:spacing w:line="190" w:lineRule="exact" w:after="0"/>
-        <w:jc w:val="left"/>
-      </w:pPr>
-      <w:r>
-        <w:rPr>
-          <w:rFonts w:ascii="Cascadia Mono" w:hAnsi="Cascadia Mono" w:cs="Cascadia Mono"/>
-          <w:b w:val="0"/>
-          <w:sz w:val="19"/>
-        </w:rPr>
-        <w:t xml:space="preserve">          ],</w:t>
-      </w:r>
-    </w:p>
-    <w:p>
-      <w:pPr>
-        <w:spacing w:line="190" w:lineRule="exact" w:after="0"/>
-        <w:jc w:val="left"/>
-      </w:pPr>
-      <w:r>
-        <w:rPr>
-          <w:rFonts w:ascii="Cascadia Mono" w:hAnsi="Cascadia Mono" w:cs="Cascadia Mono"/>
-          <w:b w:val="0"/>
-          <w:sz w:val="19"/>
-        </w:rPr>
-        <w:t xml:space="preserve">        ),</w:t>
-      </w:r>
-    </w:p>
-    <w:p>
-      <w:pPr>
-        <w:spacing w:line="190" w:lineRule="exact" w:after="0"/>
-        <w:jc w:val="left"/>
-      </w:pPr>
-      <w:r>
-        <w:rPr>
-          <w:rFonts w:ascii="Cascadia Mono" w:hAnsi="Cascadia Mono" w:cs="Cascadia Mono"/>
-          <w:b w:val="0"/>
-          <w:sz w:val="19"/>
-        </w:rPr>
-        <w:t xml:space="preserve">      ),</w:t>
-      </w:r>
-    </w:p>
-    <w:p>
-      <w:pPr>
-        <w:spacing w:line="190" w:lineRule="exact" w:after="0"/>
-        <w:jc w:val="left"/>
-      </w:pPr>
-      <w:r>
-        <w:rPr>
-          <w:rFonts w:ascii="Cascadia Mono" w:hAnsi="Cascadia Mono" w:cs="Cascadia Mono"/>
-          <w:b w:val="0"/>
-          <w:sz w:val="19"/>
-        </w:rPr>
-        <w:t xml:space="preserve">      floatingActionButtonLocation: FloatingActionButtonLocation.centerFloat,</w:t>
-      </w:r>
-    </w:p>
-    <w:p>
-      <w:pPr>
-        <w:spacing w:line="190" w:lineRule="exact" w:after="0"/>
-        <w:jc w:val="left"/>
-      </w:pPr>
-      <w:r>
-        <w:rPr>
-          <w:rFonts w:ascii="Cascadia Mono" w:hAnsi="Cascadia Mono" w:cs="Cascadia Mono"/>
-          <w:b w:val="0"/>
-          <w:sz w:val="19"/>
-        </w:rPr>
-        <w:t xml:space="preserve">      floatingActionButton: FloatingActionButton.extended(</w:t>
-      </w:r>
-    </w:p>
-    <w:p>
-      <w:pPr>
-        <w:spacing w:line="190" w:lineRule="exact" w:after="0"/>
-        <w:jc w:val="left"/>
-      </w:pPr>
-      <w:r>
-        <w:rPr>
-          <w:rFonts w:ascii="Cascadia Mono" w:hAnsi="Cascadia Mono" w:cs="Cascadia Mono"/>
-          <w:b w:val="0"/>
-          <w:sz w:val="19"/>
-        </w:rPr>
-        <w:t xml:space="preserve">        onPressed: () {},</w:t>
-      </w:r>
-    </w:p>
-    <w:p>
-      <w:pPr>
-        <w:spacing w:line="190" w:lineRule="exact" w:after="0"/>
-        <w:jc w:val="left"/>
-      </w:pPr>
-      <w:r>
-        <w:rPr>
-          <w:rFonts w:ascii="Cascadia Mono" w:hAnsi="Cascadia Mono" w:cs="Cascadia Mono"/>
-          <w:b w:val="0"/>
-          <w:sz w:val="19"/>
-        </w:rPr>
-        <w:t xml:space="preserve">        backgroundColor: const Color(0xFFD4FF00),</w:t>
-      </w:r>
-    </w:p>
-    <w:p>
-      <w:pPr>
-        <w:spacing w:line="190" w:lineRule="exact" w:after="0"/>
-        <w:jc w:val="left"/>
-      </w:pPr>
-      <w:r>
-        <w:rPr>
-          <w:rFonts w:ascii="Cascadia Mono" w:hAnsi="Cascadia Mono" w:cs="Cascadia Mono"/>
-          <w:b w:val="0"/>
-          <w:sz w:val="19"/>
-        </w:rPr>
-        <w:t xml:space="preserve">        foregroundColor: const Color(0xFF0B0D11),</w:t>
-      </w:r>
-    </w:p>
-    <w:p>
-      <w:pPr>
-        <w:spacing w:line="190" w:lineRule="exact" w:after="0"/>
-        <w:jc w:val="left"/>
-      </w:pPr>
-      <w:r>
-        <w:rPr>
-          <w:rFonts w:ascii="Cascadia Mono" w:hAnsi="Cascadia Mono" w:cs="Cascadia Mono"/>
-          <w:b w:val="0"/>
-          <w:sz w:val="19"/>
-        </w:rPr>
-        <w:t xml:space="preserve">        icon: const Icon(Icons.add),</w:t>
-      </w:r>
-    </w:p>
-    <w:p>
-      <w:pPr>
-        <w:spacing w:line="190" w:lineRule="exact" w:after="0"/>
-        <w:jc w:val="left"/>
-      </w:pPr>
-      <w:r>
-        <w:rPr>
-          <w:rFonts w:ascii="Cascadia Mono" w:hAnsi="Cascadia Mono" w:cs="Cascadia Mono"/>
-          <w:b w:val="0"/>
-          <w:sz w:val="19"/>
-        </w:rPr>
-        <w:t xml:space="preserve">        label: const Text('Додати завдання'),</w:t>
-      </w:r>
-    </w:p>
-    <w:p>
-      <w:pPr>
-        <w:spacing w:line="190" w:lineRule="exact" w:after="0"/>
-        <w:jc w:val="left"/>
-      </w:pPr>
-      <w:r>
-        <w:rPr>
-          <w:rFonts w:ascii="Cascadia Mono" w:hAnsi="Cascadia Mono" w:cs="Cascadia Mono"/>
-          <w:b w:val="0"/>
-          <w:sz w:val="19"/>
-        </w:rPr>
-        <w:t xml:space="preserve">      ),</w:t>
-      </w:r>
-    </w:p>
-    <w:p>
-      <w:pPr>
-        <w:spacing w:line="190" w:lineRule="exact" w:after="0"/>
-        <w:jc w:val="left"/>
-      </w:pPr>
-      <w:r>
-        <w:rPr>
-          <w:rFonts w:ascii="Cascadia Mono" w:hAnsi="Cascadia Mono" w:cs="Cascadia Mono"/>
-          <w:b w:val="0"/>
-          <w:sz w:val="19"/>
-        </w:rPr>
-        <w:t xml:space="preserve">    );</w:t>
-      </w:r>
-    </w:p>
-    <w:p>
-      <w:pPr>
-        <w:spacing w:line="190" w:lineRule="exact" w:after="0"/>
-        <w:jc w:val="left"/>
-      </w:pPr>
-      <w:r>
-        <w:rPr>
-          <w:rFonts w:ascii="Cascadia Mono" w:hAnsi="Cascadia Mono" w:cs="Cascadia Mono"/>
-          <w:b w:val="0"/>
-          <w:sz w:val="19"/>
-        </w:rPr>
-        <w:t xml:space="preserve">  }</w:t>
+        <w:t xml:space="preserve">  // ... (пропуск неістотних рядків)</w:t>
       </w:r>
     </w:p>
     <w:p>

</xml_diff>

<commit_message>
repo cleanup: remove build caches, abandoned storage_app, debug shots, stale previews; add repo links to all reports
</commit_message>
<xml_diff>
--- a/Lab_1/ПМД_КН-2327Б_Багрій-Белз_ЛР-1.docx
+++ b/Lab_1/ПМД_КН-2327Б_Багрій-Белз_ЛР-1.docx
@@ -594,6 +594,34 @@
     </w:p>
     <w:p>
       <w:pPr>
+        <w:spacing w:line="276" w:lineRule="auto" w:after="0"/>
+        <w:jc w:val="both"/>
+      </w:pPr>
+      <w:r>
+        <w:rPr>
+          <w:rFonts w:ascii="Times New Roman" w:hAnsi="Times New Roman" w:cs="Times New Roman"/>
+          <w:b w:val="0"/>
+          <w:sz w:val="28"/>
+        </w:rPr>
+        <w:t>Репозиторій з кодом лабораторних робіт: https://github.com/bahriibelzandrii/PMD</w:t>
+      </w:r>
+    </w:p>
+    <w:p>
+      <w:pPr>
+        <w:spacing w:line="276" w:lineRule="auto" w:after="0"/>
+        <w:jc w:val="both"/>
+      </w:pPr>
+      <w:r>
+        <w:rPr>
+          <w:rFonts w:ascii="Times New Roman" w:hAnsi="Times New Roman" w:cs="Times New Roman"/>
+          <w:b w:val="0"/>
+          <w:sz w:val="28"/>
+        </w:rPr>
+        <w:t>Код і матеріали цієї лабораторної роботи: https://github.com/bahriibelzandrii/PMD/tree/main/Lab_1</w:t>
+      </w:r>
+    </w:p>
+    <w:p>
+      <w:pPr>
         <w:spacing w:line="276" w:lineRule="auto"/>
         <w:jc w:val="both"/>
       </w:pPr>

</xml_diff>